<commit_message>
Brighter unrated tiles, 'User manual' button, original paper in About; manual review
- Unrated tile colour fields at 45% instead of 25% (moving 72%)
- About box cites Gould et al. 2012 (J Voice) with a DOI link; the paper's
  PDF stays out of the repo (publisher copyright)
- Manual: Michael's review, plus fixes to the DOI link, an author initial
  and the citation's issue and page numbers; served PDF re-exported

Co-Authored-By: Claude Opus 5.5 (1M context) <noreply@anthropic.com>
</commit_message>
<xml_diff>
--- a/docs/NeAR-user-manual.docx
+++ b/docs/NeAR-user-manual.docx
@@ -35,7 +35,7 @@
           </w:tblGrid>
           <w:tr>
             <w:trPr>
-              <w:trHeight w:val="2880"/>
+              <w:trHeight w:val="2061"/>
               <w:jc w:val="center"/>
             </w:trPr>
             <w:tc>
@@ -73,7 +73,6 @@
                 <w:dataBinding w:prefixMappings="xmlns:ns0='http://schemas.openxmlformats.org/package/2006/metadata/core-properties' xmlns:ns1='http://purl.org/dc/elements/1.1/'" w:xpath="/ns0:coreProperties[1]/ns1:title[1]" w:storeItemID="{6C3C8BC8-F283-45AE-878A-BAB7291924A1}"/>
                 <w:text/>
               </w:sdtPr>
-              <w:sdtEndPr/>
               <w:sdtContent>
                 <w:tc>
                   <w:tcPr>
@@ -126,7 +125,6 @@
                 <w:dataBinding w:prefixMappings="xmlns:ns0='http://schemas.openxmlformats.org/package/2006/metadata/core-properties' xmlns:ns1='http://purl.org/dc/elements/1.1/'" w:xpath="/ns0:coreProperties[1]/ns1:subject[1]" w:storeItemID="{6C3C8BC8-F283-45AE-878A-BAB7291924A1}"/>
                 <w:text/>
               </w:sdtPr>
-              <w:sdtEndPr/>
               <w:sdtContent>
                 <w:tc>
                   <w:tcPr>
@@ -198,7 +196,6 @@
                   <w:dataBinding w:prefixMappings="xmlns:ns0='http://schemas.openxmlformats.org/package/2006/metadata/core-properties' xmlns:ns1='http://purl.org/dc/elements/1.1/'" w:xpath="/ns0:coreProperties[1]/ns1:creator[1]" w:storeItemID="{6C3C8BC8-F283-45AE-878A-BAB7291924A1}"/>
                   <w:text/>
                 </w:sdtPr>
-                <w:sdtEndPr/>
                 <w:sdtContent>
                   <w:p>
                     <w:pPr>
@@ -220,6 +217,23 @@
                   </w:p>
                 </w:sdtContent>
               </w:sdt>
+              <w:p>
+                <w:pPr>
+                  <w:pStyle w:val="NoSpacing"/>
+                  <w:jc w:val="center"/>
+                  <w:rPr>
+                    <w:b/>
+                    <w:bCs/>
+                  </w:rPr>
+                </w:pPr>
+                <w:r>
+                  <w:rPr>
+                    <w:b/>
+                    <w:bCs/>
+                  </w:rPr>
+                  <w:t>Original Windows edition, 2010-2012</w:t>
+                </w:r>
+              </w:p>
               <w:p>
                 <w:pPr>
                   <w:pStyle w:val="NoSpacing"/>
@@ -397,6 +411,33 @@
                     <w:bCs/>
                   </w:rPr>
                 </w:pPr>
+                <w:r>
+                  <w:rPr>
+                    <w:b/>
+                    <w:bCs/>
+                  </w:rPr>
+                  <w:t>We hope you find NeAR useful.</w:t>
+                </w:r>
+              </w:p>
+              <w:p>
+                <w:pPr>
+                  <w:pStyle w:val="NoSpacing"/>
+                  <w:jc w:val="center"/>
+                  <w:rPr>
+                    <w:b/>
+                    <w:bCs/>
+                  </w:rPr>
+                </w:pPr>
+              </w:p>
+              <w:p>
+                <w:pPr>
+                  <w:pStyle w:val="NoSpacing"/>
+                  <w:jc w:val="center"/>
+                  <w:rPr>
+                    <w:b/>
+                    <w:bCs/>
+                  </w:rPr>
+                </w:pPr>
               </w:p>
               <w:p>
                 <w:pPr>
@@ -412,8 +453,81 @@
                     <w:b/>
                     <w:bCs/>
                   </w:rPr>
-                  <w:t>We hope you find NeAR useful.</w:t>
+                  <w:t xml:space="preserve">The </w:t>
                 </w:r>
+                <w:r>
+                  <w:rPr>
+                    <w:b/>
+                    <w:bCs/>
+                  </w:rPr>
+                  <w:t>original manuscript</w:t>
+                </w:r>
+                <w:r>
+                  <w:rPr>
+                    <w:b/>
+                    <w:bCs/>
+                  </w:rPr>
+                  <w:t xml:space="preserve"> describing a simple validation</w:t>
+                </w:r>
+                <w:r>
+                  <w:rPr>
+                    <w:b/>
+                    <w:bCs/>
+                  </w:rPr>
+                  <w:t xml:space="preserve"> is at:</w:t>
+                </w:r>
+              </w:p>
+              <w:p>
+                <w:pPr>
+                  <w:pStyle w:val="NoSpacing"/>
+                  <w:jc w:val="center"/>
+                  <w:rPr>
+                    <w:b/>
+                    <w:bCs/>
+                  </w:rPr>
+                </w:pPr>
+              </w:p>
+              <w:p>
+                <w:pPr>
+                  <w:pStyle w:val="NoSpacing"/>
+                  <w:jc w:val="center"/>
+                </w:pPr>
+                <w:hyperlink r:id="rId9" w:history="1">
+                  <w:r>
+                    <w:rPr>
+                      <w:rStyle w:val="Hyperlink"/>
+                    </w:rPr>
+                    <w:t>https://</w:t>
+                  </w:r>
+                  <w:r>
+                    <w:rPr>
+                      <w:rStyle w:val="Hyperlink"/>
+                    </w:rPr>
+                    <w:t>doi.org/10.1016</w:t>
+                  </w:r>
+                  <w:r>
+                    <w:rPr>
+                      <w:rStyle w:val="Hyperlink"/>
+                    </w:rPr>
+                    <w:t>/</w:t>
+                  </w:r>
+                  <w:r>
+                    <w:rPr>
+                      <w:rStyle w:val="Hyperlink"/>
+                    </w:rPr>
+                    <w:t>j.jvoice.2011.07.011</w:t>
+                  </w:r>
+                </w:hyperlink>
+              </w:p>
+              <w:p>
+                <w:pPr>
+                  <w:pStyle w:val="NoSpacing"/>
+                  <w:jc w:val="center"/>
+                  <w:rPr>
+                    <w:b/>
+                    <w:bCs/>
+                  </w:rPr>
+                </w:pPr>
               </w:p>
               <w:p>
                 <w:pPr>
@@ -456,22 +570,22 @@
                 <w:pPr>
                   <w:pStyle w:val="NoSpacing"/>
                   <w:jc w:val="center"/>
-                  <w:rPr>
-                    <w:b/>
-                    <w:bCs/>
-                  </w:rPr>
                 </w:pPr>
-                <w:hyperlink r:id="rId9" w:history="1">
+                <w:hyperlink r:id="rId10" w:history="1">
                   <w:r>
                     <w:rPr>
                       <w:rStyle w:val="Hyperlink"/>
-                      <w:b/>
-                      <w:bCs/>
                       <w:lang w:val="en-GB" w:eastAsia="en-GB"/>
                     </w:rPr>
                     <w:t>https://michaeldrinnan.github.io/NeAR/</w:t>
                   </w:r>
                 </w:hyperlink>
+              </w:p>
+              <w:p>
+                <w:pPr>
+                  <w:pStyle w:val="NoSpacing"/>
+                  <w:jc w:val="center"/>
+                </w:pPr>
               </w:p>
               <w:p>
                 <w:pPr>
@@ -519,7 +633,7 @@
                     <w:bCs/>
                   </w:rPr>
                 </w:pPr>
-                <w:hyperlink r:id="rId10" w:history="1">
+                <w:hyperlink r:id="rId11" w:history="1">
                   <w:r>
                     <w:rPr>
                       <w:rStyle w:val="Hyperlink"/>
@@ -2935,7 +3049,7 @@
       <w:r>
         <w:t xml:space="preserve"> (</w:t>
       </w:r>
-      <w:hyperlink r:id="rId11" w:history="1">
+      <w:hyperlink r:id="rId12" w:history="1">
         <w:r>
           <w:rPr>
             <w:rStyle w:val="Hyperlink"/>
@@ -3332,7 +3446,7 @@
                     </pic:cNvPicPr>
                   </pic:nvPicPr>
                   <pic:blipFill>
-                    <a:blip r:embed="rId12">
+                    <a:blip r:embed="rId13">
                       <a:extLst>
                         <a:ext uri="{28A0092B-C50C-407E-A947-70E740481C1C}">
                           <a14:useLocalDpi xmlns:a14="http://schemas.microsoft.com/office/drawing/2010/main" val="0"/>
@@ -3415,9 +3529,10 @@
         </w:numPr>
       </w:pPr>
       <w:r>
-        <w:t>If you’ve specified any reference files, they will appear at the top of the screen in plain blue, as in the example below.</w:t>
-      </w:r>
-    </w:p>
+        <w:t>If you specified reference files they appear at the top of the screen in plain blue, as in the example below.</w:t>
+      </w:r>
+    </w:p>
+    <w:p/>
     <w:p>
       <w:pPr>
         <w:jc w:val="center"/>
@@ -3429,11 +3544,10 @@
         <w:rPr>
           <w:noProof/>
         </w:rPr>
-        <w:lastRenderedPageBreak/>
         <w:drawing>
-          <wp:inline distT="0" distB="0" distL="0" distR="0" wp14:anchorId="27AEEDCF" wp14:editId="0D9F084E">
-            <wp:extent cx="4434003" cy="3336587"/>
-            <wp:effectExtent l="0" t="0" r="0" b="3810"/>
+          <wp:inline distT="0" distB="0" distL="0" distR="0" wp14:anchorId="27AEEDCF" wp14:editId="2E07963B">
+            <wp:extent cx="3562350" cy="2680669"/>
+            <wp:effectExtent l="0" t="0" r="0" b="5715"/>
             <wp:docPr id="17" name="Picture 1"/>
             <wp:cNvGraphicFramePr>
               <a:graphicFrameLocks xmlns:a="http://schemas.openxmlformats.org/drawingml/2006/main" noChangeAspect="1"/>
@@ -3448,7 +3562,7 @@
                     </pic:cNvPicPr>
                   </pic:nvPicPr>
                   <pic:blipFill>
-                    <a:blip r:embed="rId13">
+                    <a:blip r:embed="rId14">
                       <a:extLst>
                         <a:ext uri="{28A0092B-C50C-407E-A947-70E740481C1C}">
                           <a14:useLocalDpi xmlns:a14="http://schemas.microsoft.com/office/drawing/2010/main" val="0"/>
@@ -3463,7 +3577,7 @@
                   <pic:spPr bwMode="auto">
                     <a:xfrm>
                       <a:off x="0" y="0"/>
-                      <a:ext cx="4446116" cy="3345702"/>
+                      <a:ext cx="3584435" cy="2697288"/>
                     </a:xfrm>
                     <a:prstGeom prst="rect">
                       <a:avLst/>
@@ -3486,6 +3600,7 @@
       </w:pPr>
       <w:bookmarkStart w:id="12" w:name="_Toc241786192"/>
       <w:r>
+        <w:lastRenderedPageBreak/>
         <w:t>Perform</w:t>
       </w:r>
       <w:r>
@@ -3628,7 +3743,6 @@
         <w:rPr>
           <w:noProof/>
         </w:rPr>
-        <w:lastRenderedPageBreak/>
         <w:drawing>
           <wp:inline distT="0" distB="0" distL="0" distR="0" wp14:anchorId="1BBA3CB5" wp14:editId="69BE188E">
             <wp:extent cx="5351829" cy="4027251"/>
@@ -3647,7 +3761,7 @@
                     </pic:cNvPicPr>
                   </pic:nvPicPr>
                   <pic:blipFill>
-                    <a:blip r:embed="rId14">
+                    <a:blip r:embed="rId15">
                       <a:extLst>
                         <a:ext uri="{28A0092B-C50C-407E-A947-70E740481C1C}">
                           <a14:useLocalDpi xmlns:a14="http://schemas.microsoft.com/office/drawing/2010/main" val="0"/>
@@ -3807,11 +3921,7 @@
         <w:t xml:space="preserve"> to load the existing results file.</w:t>
       </w:r>
     </w:p>
-    <w:p>
-      <w:pPr>
-        <w:pStyle w:val="Heading1"/>
-      </w:pPr>
-    </w:p>
+    <w:p/>
     <w:p>
       <w:pPr>
         <w:pStyle w:val="Heading1"/>
@@ -3981,6 +4091,7 @@
       </w:pPr>
       <w:bookmarkStart w:id="18" w:name="_Toc241786198"/>
       <w:r>
+        <w:lastRenderedPageBreak/>
         <w:t>Loading the data into Excel</w:t>
       </w:r>
       <w:bookmarkEnd w:id="18"/>
@@ -4221,7 +4332,7 @@
           </mc:Choice>
           <mc:Fallback>
             <w:pict>
-              <v:rect w14:anchorId="774F889C" id="Rectangle 3" o:spid="_x0000_s1026" style="position:absolute;margin-left:34.5pt;margin-top:19.65pt;width:17pt;height:26pt;z-index:251659264;visibility:visible;mso-wrap-style:square;mso-width-percent:0;mso-wrap-distance-left:9pt;mso-wrap-distance-top:0;mso-wrap-distance-right:9pt;mso-wrap-distance-bottom:0;mso-position-horizontal:absolute;mso-position-horizontal-relative:text;mso-position-vertical:absolute;mso-position-vertical-relative:text;mso-width-percent:0;mso-width-relative:margin;v-text-anchor:middle" o:gfxdata="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" filled="f" strokecolor="#c00000" strokeweight="2pt"/>
+              <v:rect w14:anchorId="03EE8FD9" id="Rectangle 3" o:spid="_x0000_s1026" style="position:absolute;margin-left:34.5pt;margin-top:19.65pt;width:17pt;height:26pt;z-index:251659264;visibility:visible;mso-wrap-style:square;mso-width-percent:0;mso-wrap-distance-left:9pt;mso-wrap-distance-top:0;mso-wrap-distance-right:9pt;mso-wrap-distance-bottom:0;mso-position-horizontal:absolute;mso-position-horizontal-relative:text;mso-position-vertical:absolute;mso-position-vertical-relative:text;mso-width-percent:0;mso-width-relative:margin;v-text-anchor:middle" o:gfxdata="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" filled="f" strokecolor="#c00000" strokeweight="2pt"/>
             </w:pict>
           </mc:Fallback>
         </mc:AlternateContent>
@@ -4235,76 +4346,6 @@
             <wp:extent cx="5829300" cy="1551366"/>
             <wp:effectExtent l="0" t="0" r="0" b="0"/>
             <wp:docPr id="1" name="Picture 1"/>
-            <wp:cNvGraphicFramePr>
-              <a:graphicFrameLocks xmlns:a="http://schemas.openxmlformats.org/drawingml/2006/main" noChangeAspect="1"/>
-            </wp:cNvGraphicFramePr>
-            <a:graphic xmlns:a="http://schemas.openxmlformats.org/drawingml/2006/main">
-              <a:graphicData uri="http://schemas.openxmlformats.org/drawingml/2006/picture">
-                <pic:pic xmlns:pic="http://schemas.openxmlformats.org/drawingml/2006/picture">
-                  <pic:nvPicPr>
-                    <pic:cNvPr id="0" name=""/>
-                    <pic:cNvPicPr/>
-                  </pic:nvPicPr>
-                  <pic:blipFill>
-                    <a:blip r:embed="rId15"/>
-                    <a:stretch>
-                      <a:fillRect/>
-                    </a:stretch>
-                  </pic:blipFill>
-                  <pic:spPr>
-                    <a:xfrm>
-                      <a:off x="0" y="0"/>
-                      <a:ext cx="5829300" cy="1551366"/>
-                    </a:xfrm>
-                    <a:prstGeom prst="rect">
-                      <a:avLst/>
-                    </a:prstGeom>
-                  </pic:spPr>
-                </pic:pic>
-              </a:graphicData>
-            </a:graphic>
-          </wp:inline>
-        </w:drawing>
-      </w:r>
-    </w:p>
-    <w:p/>
-    <w:p>
-      <w:r>
-        <w:t xml:space="preserve">Select the file you want to import, then pick a </w:t>
-      </w:r>
-      <w:r>
-        <w:rPr>
-          <w:b/>
-        </w:rPr>
-        <w:t>Delimited</w:t>
-      </w:r>
-      <w:r>
-        <w:t xml:space="preserve"> file, and a </w:t>
-      </w:r>
-      <w:r>
-        <w:rPr>
-          <w:b/>
-        </w:rPr>
-        <w:t>Comma</w:t>
-      </w:r>
-      <w:r>
-        <w:t xml:space="preserve"> delimiter like this:</w:t>
-      </w:r>
-    </w:p>
-    <w:p/>
-    <w:p>
-      <w:pPr>
-        <w:jc w:val="center"/>
-      </w:pPr>
-      <w:r>
-        <w:rPr>
-          <w:noProof/>
-        </w:rPr>
-        <w:drawing>
-          <wp:inline distT="0" distB="0" distL="0" distR="0" wp14:anchorId="6858AB80" wp14:editId="2CB84CA8">
-            <wp:extent cx="2757858" cy="1980000"/>
-            <wp:effectExtent l="0" t="0" r="4445" b="1270"/>
-            <wp:docPr id="7" name="Picture 7"/>
             <wp:cNvGraphicFramePr>
               <a:graphicFrameLocks xmlns:a="http://schemas.openxmlformats.org/drawingml/2006/main" noChangeAspect="1"/>
             </wp:cNvGraphicFramePr>
@@ -4324,7 +4365,7 @@
                   <pic:spPr>
                     <a:xfrm>
                       <a:off x="0" y="0"/>
-                      <a:ext cx="2757858" cy="1980000"/>
+                      <a:ext cx="5829300" cy="1551366"/>
                     </a:xfrm>
                     <a:prstGeom prst="rect">
                       <a:avLst/>
@@ -4336,18 +4377,45 @@
           </wp:inline>
         </w:drawing>
       </w:r>
-      <w:r>
-        <w:t xml:space="preserve">        </w:t>
-      </w:r>
+    </w:p>
+    <w:p/>
+    <w:p>
+      <w:r>
+        <w:t xml:space="preserve">Select the file you want to import, then pick a </w:t>
+      </w:r>
+      <w:r>
+        <w:rPr>
+          <w:b/>
+        </w:rPr>
+        <w:t>Delimited</w:t>
+      </w:r>
+      <w:r>
+        <w:t xml:space="preserve"> file, and a </w:t>
+      </w:r>
+      <w:r>
+        <w:rPr>
+          <w:b/>
+        </w:rPr>
+        <w:t>Comma</w:t>
+      </w:r>
+      <w:r>
+        <w:t xml:space="preserve"> delimiter like this:</w:t>
+      </w:r>
+    </w:p>
+    <w:p/>
+    <w:p>
+      <w:pPr>
+        <w:jc w:val="center"/>
+      </w:pPr>
       <w:r>
         <w:rPr>
           <w:noProof/>
         </w:rPr>
         <w:drawing>
-          <wp:inline distT="0" distB="0" distL="0" distR="0" wp14:anchorId="356185E0" wp14:editId="7959A8BB">
-            <wp:extent cx="2757857" cy="1980000"/>
+          <wp:inline distT="0" distB="0" distL="0" distR="0" wp14:anchorId="6858AB80" wp14:editId="2CB84CA8">
+            <wp:extent cx="2757858" cy="1980000"/>
             <wp:effectExtent l="0" t="0" r="4445" b="1270"/>
-            <wp:docPr id="8" name="Picture 8"/>
+            <wp:docPr id="7" name="Picture 7"/>
             <wp:cNvGraphicFramePr>
               <a:graphicFrameLocks xmlns:a="http://schemas.openxmlformats.org/drawingml/2006/main" noChangeAspect="1"/>
             </wp:cNvGraphicFramePr>
@@ -4367,6 +4435,49 @@
                   <pic:spPr>
                     <a:xfrm>
                       <a:off x="0" y="0"/>
+                      <a:ext cx="2757858" cy="1980000"/>
+                    </a:xfrm>
+                    <a:prstGeom prst="rect">
+                      <a:avLst/>
+                    </a:prstGeom>
+                  </pic:spPr>
+                </pic:pic>
+              </a:graphicData>
+            </a:graphic>
+          </wp:inline>
+        </w:drawing>
+      </w:r>
+      <w:r>
+        <w:t xml:space="preserve">        </w:t>
+      </w:r>
+      <w:r>
+        <w:rPr>
+          <w:noProof/>
+        </w:rPr>
+        <w:drawing>
+          <wp:inline distT="0" distB="0" distL="0" distR="0" wp14:anchorId="356185E0" wp14:editId="7959A8BB">
+            <wp:extent cx="2757857" cy="1980000"/>
+            <wp:effectExtent l="0" t="0" r="4445" b="1270"/>
+            <wp:docPr id="8" name="Picture 8"/>
+            <wp:cNvGraphicFramePr>
+              <a:graphicFrameLocks xmlns:a="http://schemas.openxmlformats.org/drawingml/2006/main" noChangeAspect="1"/>
+            </wp:cNvGraphicFramePr>
+            <a:graphic xmlns:a="http://schemas.openxmlformats.org/drawingml/2006/main">
+              <a:graphicData uri="http://schemas.openxmlformats.org/drawingml/2006/picture">
+                <pic:pic xmlns:pic="http://schemas.openxmlformats.org/drawingml/2006/picture">
+                  <pic:nvPicPr>
+                    <pic:cNvPr id="0" name=""/>
+                    <pic:cNvPicPr/>
+                  </pic:nvPicPr>
+                  <pic:blipFill>
+                    <a:blip r:embed="rId18"/>
+                    <a:stretch>
+                      <a:fillRect/>
+                    </a:stretch>
+                  </pic:blipFill>
+                  <pic:spPr>
+                    <a:xfrm>
+                      <a:off x="0" y="0"/>
                       <a:ext cx="2757857" cy="1980000"/>
                     </a:xfrm>
                     <a:prstGeom prst="rect">
@@ -4426,6 +4537,7 @@
       </w:pPr>
       <w:bookmarkStart w:id="19" w:name="_Toc241786199"/>
       <w:r>
+        <w:lastRenderedPageBreak/>
         <w:t>The file format</w:t>
       </w:r>
       <w:bookmarkEnd w:id="19"/>
@@ -7188,6 +7300,7 @@
       </w:pPr>
       <w:bookmarkStart w:id="21" w:name="_Toc241786201"/>
       <w:r>
+        <w:lastRenderedPageBreak/>
         <w:t>Analysing the data</w:t>
       </w:r>
       <w:bookmarkEnd w:id="21"/>
@@ -7321,9 +7434,13 @@
       </w:pPr>
       <w:bookmarkStart w:id="25" w:name="_Toc241786205"/>
       <w:r>
+        <w:lastRenderedPageBreak/>
         <w:t>What’s different from the 2012 Windows version</w:t>
       </w:r>
       <w:bookmarkEnd w:id="25"/>
+      <w:r>
+        <w:t>?</w:t>
+      </w:r>
     </w:p>
     <w:p>
       <w:r>
@@ -7540,6 +7657,46 @@
       </w:pPr>
       <w:bookmarkStart w:id="27" w:name="_Toc241786207"/>
       <w:r>
+        <w:t>Citation for this work</w:t>
+      </w:r>
+    </w:p>
+    <w:p>
+      <w:pPr>
+        <w:rPr>
+          <w:iCs/>
+        </w:rPr>
+      </w:pPr>
+      <w:r>
+        <w:t xml:space="preserve">Gould J, Waugh J, Carding P, Drinnan M. </w:t>
+      </w:r>
+      <w:r>
+        <w:rPr>
+          <w:i/>
+        </w:rPr>
+        <w:t>A new voice rating tool for clinical practice</w:t>
+      </w:r>
+      <w:r>
+        <w:t xml:space="preserve">. </w:t>
+      </w:r>
+      <w:r>
+        <w:rPr>
+          <w:iCs/>
+        </w:rPr>
+        <w:t>Journal of Voice 2012; 26(4): e163-70. DOI: 10.1016/j.jvoice.2011.07.011</w:t>
+      </w:r>
+    </w:p>
+    <w:p>
+      <w:pPr>
+        <w:rPr>
+          <w:iCs/>
+        </w:rPr>
+      </w:pPr>
+    </w:p>
+    <w:p>
+      <w:pPr>
+        <w:pStyle w:val="Heading1"/>
+      </w:pPr>
+      <w:r>
         <w:t>Acknowledgements</w:t>
       </w:r>
       <w:bookmarkEnd w:id="27"/>
@@ -7570,16 +7727,22 @@
       </w:r>
       <w:r>
         <w:t>.</w:t>
+      </w:r>
+    </w:p>
+    <w:p/>
+    <w:p>
+      <w:r>
+        <w:t>Thanks also to Claude for help with the translation from C# to TypeScript.</w:t>
       </w:r>
     </w:p>
     <w:p/>
     <w:sectPr>
-      <w:headerReference w:type="even" r:id="rId18"/>
-      <w:headerReference w:type="default" r:id="rId19"/>
-      <w:footerReference w:type="even" r:id="rId20"/>
-      <w:footerReference w:type="default" r:id="rId21"/>
-      <w:headerReference w:type="first" r:id="rId22"/>
-      <w:footerReference w:type="first" r:id="rId23"/>
+      <w:headerReference w:type="even" r:id="rId19"/>
+      <w:headerReference w:type="default" r:id="rId20"/>
+      <w:footerReference w:type="even" r:id="rId21"/>
+      <w:footerReference w:type="default" r:id="rId22"/>
+      <w:headerReference w:type="first" r:id="rId23"/>
+      <w:footerReference w:type="first" r:id="rId24"/>
       <w:pgSz w:w="11906" w:h="16838"/>
       <w:pgMar w:top="851" w:right="1276" w:bottom="816" w:left="1276" w:header="709" w:footer="709" w:gutter="0"/>
       <w:pgNumType w:start="0"/>
@@ -8904,7 +9067,6 @@
   <w:style w:type="character" w:default="1" w:styleId="DefaultParagraphFont">
     <w:name w:val="Default Paragraph Font"/>
     <w:uiPriority w:val="1"/>
-    <w:semiHidden/>
     <w:unhideWhenUsed/>
   </w:style>
   <w:style w:type="table" w:default="1" w:styleId="TableNormal">
@@ -9118,6 +9280,27 @@
       <w:bCs/>
     </w:rPr>
   </w:style>
+  <w:style w:type="character" w:styleId="UnresolvedMention">
+    <w:name w:val="Unresolved Mention"/>
+    <w:basedOn w:val="DefaultParagraphFont"/>
+    <w:uiPriority w:val="99"/>
+    <w:semiHidden/>
+    <w:unhideWhenUsed/>
+    <w:rsid w:val="005239C5"/>
+    <w:rPr>
+      <w:color w:val="605E5C"/>
+      <w:shd w:val="clear" w:color="auto" w:fill="E1DFDD"/>
+    </w:rPr>
+  </w:style>
+  <w:style w:type="character" w:styleId="FollowedHyperlink">
+    <w:name w:val="FollowedHyperlink"/>
+    <w:basedOn w:val="DefaultParagraphFont"/>
+    <w:rsid w:val="005239C5"/>
+    <w:rPr>
+      <w:color w:val="800080" w:themeColor="followedHyperlink"/>
+      <w:u w:val="single"/>
+    </w:rPr>
+  </w:style>
 </w:styles>
 </file>
 
@@ -9235,7 +9418,6 @@
     <w:sig w:usb0="E4002EFF" w:usb1="C200247B" w:usb2="00000009" w:usb3="00000000" w:csb0="000001FF" w:csb1="00000000"/>
   </w:font>
   <w:font w:name="MS Mincho">
-    <w:altName w:val="ＭＳ 明朝"/>
     <w:panose1 w:val="02020609040205080304"/>
     <w:charset w:val="80"/>
     <w:family w:val="modern"/>
@@ -9293,9 +9475,11 @@
     <w:rsid w:val="00751B80"/>
     <w:rsid w:val="00A45C21"/>
     <w:rsid w:val="00B30F14"/>
+    <w:rsid w:val="00B50C68"/>
     <w:rsid w:val="00B630E6"/>
     <w:rsid w:val="00D20BD6"/>
     <w:rsid w:val="00E63130"/>
+    <w:rsid w:val="00FF35EB"/>
   </w:rsids>
   <m:mathPr>
     <m:mathFont m:val="Cambria Math"/>

</xml_diff>

<commit_message>
Add 'Read the user manual' to the New to NeAR panel; dark start screen in manual
Co-Authored-By: Claude Opus 5.5 (1M context) <noreply@anthropic.com>
</commit_message>
<xml_diff>
--- a/docs/NeAR-user-manual.docx
+++ b/docs/NeAR-user-manual.docx
@@ -3430,7 +3430,7 @@
         </w:rPr>
         <w:drawing>
           <wp:inline distT="0" distB="0" distL="0" distR="0" wp14:anchorId="2CD82FCE" wp14:editId="7C9E0A79">
-            <wp:extent cx="3949430" cy="4295005"/>
+            <wp:extent cx="3949430" cy="4566528"/>
             <wp:effectExtent l="0" t="0" r="635" b="1905"/>
             <wp:docPr id="13" name="Picture 1"/>
             <wp:cNvGraphicFramePr>
@@ -3461,7 +3461,7 @@
                   <pic:spPr bwMode="auto">
                     <a:xfrm>
                       <a:off x="0" y="0"/>
-                      <a:ext cx="3949430" cy="4295005"/>
+                      <a:ext cx="3949430" cy="4566528"/>
                     </a:xfrm>
                     <a:prstGeom prst="rect">
                       <a:avLst/>

</xml_diff>

<commit_message>
Manual: dark-mode rating screen screenshots
Co-Authored-By: Claude Opus 5.5 (1M context) <noreply@anthropic.com>
</commit_message>
<xml_diff>
--- a/docs/NeAR-user-manual.docx
+++ b/docs/NeAR-user-manual.docx
@@ -3546,7 +3546,7 @@
         </w:rPr>
         <w:drawing>
           <wp:inline distT="0" distB="0" distL="0" distR="0" wp14:anchorId="27AEEDCF" wp14:editId="2E07963B">
-            <wp:extent cx="3562350" cy="2680669"/>
+            <wp:extent cx="3562350" cy="2694027"/>
             <wp:effectExtent l="0" t="0" r="0" b="5715"/>
             <wp:docPr id="17" name="Picture 1"/>
             <wp:cNvGraphicFramePr>
@@ -3577,7 +3577,7 @@
                   <pic:spPr bwMode="auto">
                     <a:xfrm>
                       <a:off x="0" y="0"/>
-                      <a:ext cx="3584435" cy="2697288"/>
+                      <a:ext cx="3584435" cy="2694027"/>
                     </a:xfrm>
                     <a:prstGeom prst="rect">
                       <a:avLst/>
@@ -3745,7 +3745,7 @@
         </w:rPr>
         <w:drawing>
           <wp:inline distT="0" distB="0" distL="0" distR="0" wp14:anchorId="1BBA3CB5" wp14:editId="69BE188E">
-            <wp:extent cx="5351829" cy="4027251"/>
+            <wp:extent cx="5351829" cy="4047320"/>
             <wp:effectExtent l="0" t="0" r="0" b="0"/>
             <wp:docPr id="23" name="Picture 1"/>
             <wp:cNvGraphicFramePr>
@@ -3776,7 +3776,7 @@
                   <pic:spPr bwMode="auto">
                     <a:xfrm>
                       <a:off x="0" y="0"/>
-                      <a:ext cx="5373786" cy="4043773"/>
+                      <a:ext cx="5373786" cy="4047320"/>
                     </a:xfrm>
                     <a:prstGeom prst="rect">
                       <a:avLst/>

</xml_diff>

<commit_message>
Add an 'Animate' rating option (on by default)
Tile animation is now a NeAR option rather than following the operating
system's reduce-motion setting, which is often off on Windows PCs. The
settle animation also has a timeout so a tile is never left hidden if the
page stops drawing. Manual: sixth tick box described; new start-screen
screenshot. End-to-end test runs with the option ticked and unticked.

Co-Authored-By: Claude Opus 5.5 (1M context) <noreply@anthropic.com>
</commit_message>
<xml_diff>
--- a/docs/NeAR-user-manual.docx
+++ b/docs/NeAR-user-manual.docx
@@ -3387,6 +3387,19 @@
     <w:p>
       <w:pPr>
         <w:pStyle w:val="ListParagraph"/>
+        <w:numPr>
+          <w:ilvl w:val="0"/>
+          <w:numId w:val="5"/>
+        </w:numPr>
+        <w:ind w:left="357"/>
+      </w:pPr>
+      <w:r>
+        <w:t xml:space="preserve">The sixth tick box, ticked to begin with, animates the samples as they are dragged and dropped, so it is easier to see where each one goes. Untick it if movement on screen is uncomfortable for the rater.</w:t>
+      </w:r>
+    </w:p>
+    <w:p>
+      <w:pPr>
+        <w:pStyle w:val="ListParagraph"/>
         <w:ind w:left="360"/>
       </w:pPr>
     </w:p>
@@ -3430,7 +3443,7 @@
         </w:rPr>
         <w:drawing>
           <wp:inline distT="0" distB="0" distL="0" distR="0" wp14:anchorId="2CD82FCE" wp14:editId="7C9E0A79">
-            <wp:extent cx="3949430" cy="4566528"/>
+            <wp:extent cx="3949430" cy="4788683"/>
             <wp:effectExtent l="0" t="0" r="635" b="1905"/>
             <wp:docPr id="13" name="Picture 1"/>
             <wp:cNvGraphicFramePr>
@@ -3461,7 +3474,7 @@
                   <pic:spPr bwMode="auto">
                     <a:xfrm>
                       <a:off x="0" y="0"/>
-                      <a:ext cx="3949430" cy="4566528"/>
+                      <a:ext cx="3949430" cy="4788683"/>
                     </a:xfrm>
                     <a:prstGeom prst="rect">
                       <a:avLst/>

</xml_diff>

<commit_message>
Manual: Michael's updates; re-issue PDF
Co-Authored-By: Claude Opus 5.5 (1M context) <noreply@anthropic.com>
</commit_message>
<xml_diff>
--- a/docs/NeAR-user-manual.docx
+++ b/docs/NeAR-user-manual.docx
@@ -416,7 +416,23 @@
                     <w:b/>
                     <w:bCs/>
                   </w:rPr>
-                  <w:t>We hope you find NeAR useful.</w:t>
+                  <w:t xml:space="preserve">We hope you find </w:t>
+                </w:r>
+                <w:proofErr w:type="spellStart"/>
+                <w:r>
+                  <w:rPr>
+                    <w:b/>
+                    <w:bCs/>
+                  </w:rPr>
+                  <w:t>NeAR</w:t>
+                </w:r>
+                <w:proofErr w:type="spellEnd"/>
+                <w:r>
+                  <w:rPr>
+                    <w:b/>
+                    <w:bCs/>
+                  </w:rPr>
+                  <w:t xml:space="preserve"> useful.</w:t>
                 </w:r>
               </w:p>
               <w:p>
@@ -453,14 +469,7 @@
                     <w:b/>
                     <w:bCs/>
                   </w:rPr>
-                  <w:t xml:space="preserve">The </w:t>
-                </w:r>
-                <w:r>
-                  <w:rPr>
-                    <w:b/>
-                    <w:bCs/>
-                  </w:rPr>
-                  <w:t>original manuscript</w:t>
+                  <w:t>The original manuscript</w:t>
                 </w:r>
                 <w:r>
                   <w:rPr>
@@ -497,25 +506,7 @@
                     <w:rPr>
                       <w:rStyle w:val="Hyperlink"/>
                     </w:rPr>
-                    <w:t>https://</w:t>
-                  </w:r>
-                  <w:r>
-                    <w:rPr>
-                      <w:rStyle w:val="Hyperlink"/>
-                    </w:rPr>
-                    <w:t>doi.org/10.1016</w:t>
-                  </w:r>
-                  <w:r>
-                    <w:rPr>
-                      <w:rStyle w:val="Hyperlink"/>
-                    </w:rPr>
-                    <w:t>/</w:t>
-                  </w:r>
-                  <w:r>
-                    <w:rPr>
-                      <w:rStyle w:val="Hyperlink"/>
-                    </w:rPr>
-                    <w:t>j.jvoice.2011.07.011</w:t>
+                    <w:t>https://doi.org/10.1016/j.jvoice.2011.07.011</w:t>
                   </w:r>
                 </w:hyperlink>
               </w:p>
@@ -741,7 +732,7 @@
           <w:r>
             <w:fldChar w:fldCharType="separate"/>
           </w:r>
-          <w:hyperlink w:anchor="_Toc241786180" w:history="1">
+          <w:hyperlink w:anchor="_Toc241790289" w:history="1">
             <w:r>
               <w:rPr>
                 <w:rStyle w:val="Hyperlink"/>
@@ -768,7 +759,7 @@
                 <w:noProof/>
                 <w:webHidden/>
               </w:rPr>
-              <w:instrText xml:space="preserve"> PAGEREF _Toc241786180 \h </w:instrText>
+              <w:instrText xml:space="preserve"> PAGEREF _Toc241790289 \h </w:instrText>
             </w:r>
             <w:r>
               <w:rPr>
@@ -813,7 +804,7 @@
               <w14:ligatures w14:val="standardContextual"/>
             </w:rPr>
           </w:pPr>
-          <w:hyperlink w:anchor="_Toc241786181" w:history="1">
+          <w:hyperlink w:anchor="_Toc241790290" w:history="1">
             <w:r>
               <w:rPr>
                 <w:rStyle w:val="Hyperlink"/>
@@ -840,7 +831,7 @@
                 <w:noProof/>
                 <w:webHidden/>
               </w:rPr>
-              <w:instrText xml:space="preserve"> PAGEREF _Toc241786181 \h </w:instrText>
+              <w:instrText xml:space="preserve"> PAGEREF _Toc241790290 \h </w:instrText>
             </w:r>
             <w:r>
               <w:rPr>
@@ -885,7 +876,7 @@
               <w14:ligatures w14:val="standardContextual"/>
             </w:rPr>
           </w:pPr>
-          <w:hyperlink w:anchor="_Toc241786182" w:history="1">
+          <w:hyperlink w:anchor="_Toc241790291" w:history="1">
             <w:r>
               <w:rPr>
                 <w:rStyle w:val="Hyperlink"/>
@@ -912,7 +903,7 @@
                 <w:noProof/>
                 <w:webHidden/>
               </w:rPr>
-              <w:instrText xml:space="preserve"> PAGEREF _Toc241786182 \h </w:instrText>
+              <w:instrText xml:space="preserve"> PAGEREF _Toc241790291 \h </w:instrText>
             </w:r>
             <w:r>
               <w:rPr>
@@ -957,7 +948,7 @@
               <w14:ligatures w14:val="standardContextual"/>
             </w:rPr>
           </w:pPr>
-          <w:hyperlink w:anchor="_Toc241786183" w:history="1">
+          <w:hyperlink w:anchor="_Toc241790292" w:history="1">
             <w:r>
               <w:rPr>
                 <w:rStyle w:val="Hyperlink"/>
@@ -984,7 +975,7 @@
                 <w:noProof/>
                 <w:webHidden/>
               </w:rPr>
-              <w:instrText xml:space="preserve"> PAGEREF _Toc241786183 \h </w:instrText>
+              <w:instrText xml:space="preserve"> PAGEREF _Toc241790292 \h </w:instrText>
             </w:r>
             <w:r>
               <w:rPr>
@@ -1029,7 +1020,7 @@
               <w14:ligatures w14:val="standardContextual"/>
             </w:rPr>
           </w:pPr>
-          <w:hyperlink w:anchor="_Toc241786184" w:history="1">
+          <w:hyperlink w:anchor="_Toc241790293" w:history="1">
             <w:r>
               <w:rPr>
                 <w:rStyle w:val="Hyperlink"/>
@@ -1056,7 +1047,7 @@
                 <w:noProof/>
                 <w:webHidden/>
               </w:rPr>
-              <w:instrText xml:space="preserve"> PAGEREF _Toc241786184 \h </w:instrText>
+              <w:instrText xml:space="preserve"> PAGEREF _Toc241790293 \h </w:instrText>
             </w:r>
             <w:r>
               <w:rPr>
@@ -1101,7 +1092,7 @@
               <w14:ligatures w14:val="standardContextual"/>
             </w:rPr>
           </w:pPr>
-          <w:hyperlink w:anchor="_Toc241786185" w:history="1">
+          <w:hyperlink w:anchor="_Toc241790294" w:history="1">
             <w:r>
               <w:rPr>
                 <w:rStyle w:val="Hyperlink"/>
@@ -1128,7 +1119,7 @@
                 <w:noProof/>
                 <w:webHidden/>
               </w:rPr>
-              <w:instrText xml:space="preserve"> PAGEREF _Toc241786185 \h </w:instrText>
+              <w:instrText xml:space="preserve"> PAGEREF _Toc241790294 \h </w:instrText>
             </w:r>
             <w:r>
               <w:rPr>
@@ -1173,7 +1164,7 @@
               <w14:ligatures w14:val="standardContextual"/>
             </w:rPr>
           </w:pPr>
-          <w:hyperlink w:anchor="_Toc241786186" w:history="1">
+          <w:hyperlink w:anchor="_Toc241790295" w:history="1">
             <w:r>
               <w:rPr>
                 <w:rStyle w:val="Hyperlink"/>
@@ -1200,7 +1191,7 @@
                 <w:noProof/>
                 <w:webHidden/>
               </w:rPr>
-              <w:instrText xml:space="preserve"> PAGEREF _Toc241786186 \h </w:instrText>
+              <w:instrText xml:space="preserve"> PAGEREF _Toc241790295 \h </w:instrText>
             </w:r>
             <w:r>
               <w:rPr>
@@ -1245,7 +1236,7 @@
               <w14:ligatures w14:val="standardContextual"/>
             </w:rPr>
           </w:pPr>
-          <w:hyperlink w:anchor="_Toc241786187" w:history="1">
+          <w:hyperlink w:anchor="_Toc241790296" w:history="1">
             <w:r>
               <w:rPr>
                 <w:rStyle w:val="Hyperlink"/>
@@ -1272,7 +1263,7 @@
                 <w:noProof/>
                 <w:webHidden/>
               </w:rPr>
-              <w:instrText xml:space="preserve"> PAGEREF _Toc241786187 \h </w:instrText>
+              <w:instrText xml:space="preserve"> PAGEREF _Toc241790296 \h </w:instrText>
             </w:r>
             <w:r>
               <w:rPr>
@@ -1317,7 +1308,7 @@
               <w14:ligatures w14:val="standardContextual"/>
             </w:rPr>
           </w:pPr>
-          <w:hyperlink w:anchor="_Toc241786188" w:history="1">
+          <w:hyperlink w:anchor="_Toc241790297" w:history="1">
             <w:r>
               <w:rPr>
                 <w:rStyle w:val="Hyperlink"/>
@@ -1344,7 +1335,7 @@
                 <w:noProof/>
                 <w:webHidden/>
               </w:rPr>
-              <w:instrText xml:space="preserve"> PAGEREF _Toc241786188 \h </w:instrText>
+              <w:instrText xml:space="preserve"> PAGEREF _Toc241790297 \h </w:instrText>
             </w:r>
             <w:r>
               <w:rPr>
@@ -1389,7 +1380,7 @@
               <w14:ligatures w14:val="standardContextual"/>
             </w:rPr>
           </w:pPr>
-          <w:hyperlink w:anchor="_Toc241786189" w:history="1">
+          <w:hyperlink w:anchor="_Toc241790298" w:history="1">
             <w:r>
               <w:rPr>
                 <w:rStyle w:val="Hyperlink"/>
@@ -1416,7 +1407,7 @@
                 <w:noProof/>
                 <w:webHidden/>
               </w:rPr>
-              <w:instrText xml:space="preserve"> PAGEREF _Toc241786189 \h </w:instrText>
+              <w:instrText xml:space="preserve"> PAGEREF _Toc241790298 \h </w:instrText>
             </w:r>
             <w:r>
               <w:rPr>
@@ -1461,7 +1452,7 @@
               <w14:ligatures w14:val="standardContextual"/>
             </w:rPr>
           </w:pPr>
-          <w:hyperlink w:anchor="_Toc241786190" w:history="1">
+          <w:hyperlink w:anchor="_Toc241790299" w:history="1">
             <w:r>
               <w:rPr>
                 <w:rStyle w:val="Hyperlink"/>
@@ -1488,7 +1479,7 @@
                 <w:noProof/>
                 <w:webHidden/>
               </w:rPr>
-              <w:instrText xml:space="preserve"> PAGEREF _Toc241786190 \h </w:instrText>
+              <w:instrText xml:space="preserve"> PAGEREF _Toc241790299 \h </w:instrText>
             </w:r>
             <w:r>
               <w:rPr>
@@ -1533,7 +1524,7 @@
               <w14:ligatures w14:val="standardContextual"/>
             </w:rPr>
           </w:pPr>
-          <w:hyperlink w:anchor="_Toc241786191" w:history="1">
+          <w:hyperlink w:anchor="_Toc241790300" w:history="1">
             <w:r>
               <w:rPr>
                 <w:rStyle w:val="Hyperlink"/>
@@ -1560,7 +1551,7 @@
                 <w:noProof/>
                 <w:webHidden/>
               </w:rPr>
-              <w:instrText xml:space="preserve"> PAGEREF _Toc241786191 \h </w:instrText>
+              <w:instrText xml:space="preserve"> PAGEREF _Toc241790300 \h </w:instrText>
             </w:r>
             <w:r>
               <w:rPr>
@@ -1605,7 +1596,7 @@
               <w14:ligatures w14:val="standardContextual"/>
             </w:rPr>
           </w:pPr>
-          <w:hyperlink w:anchor="_Toc241786192" w:history="1">
+          <w:hyperlink w:anchor="_Toc241790301" w:history="1">
             <w:r>
               <w:rPr>
                 <w:rStyle w:val="Hyperlink"/>
@@ -1632,7 +1623,7 @@
                 <w:noProof/>
                 <w:webHidden/>
               </w:rPr>
-              <w:instrText xml:space="preserve"> PAGEREF _Toc241786192 \h </w:instrText>
+              <w:instrText xml:space="preserve"> PAGEREF _Toc241790301 \h </w:instrText>
             </w:r>
             <w:r>
               <w:rPr>
@@ -1677,7 +1668,7 @@
               <w14:ligatures w14:val="standardContextual"/>
             </w:rPr>
           </w:pPr>
-          <w:hyperlink w:anchor="_Toc241786193" w:history="1">
+          <w:hyperlink w:anchor="_Toc241790302" w:history="1">
             <w:r>
               <w:rPr>
                 <w:rStyle w:val="Hyperlink"/>
@@ -1704,7 +1695,7 @@
                 <w:noProof/>
                 <w:webHidden/>
               </w:rPr>
-              <w:instrText xml:space="preserve"> PAGEREF _Toc241786193 \h </w:instrText>
+              <w:instrText xml:space="preserve"> PAGEREF _Toc241790302 \h </w:instrText>
             </w:r>
             <w:r>
               <w:rPr>
@@ -1724,7 +1715,7 @@
                 <w:noProof/>
                 <w:webHidden/>
               </w:rPr>
-              <w:t>7</w:t>
+              <w:t>6</w:t>
             </w:r>
             <w:r>
               <w:rPr>
@@ -1749,7 +1740,7 @@
               <w14:ligatures w14:val="standardContextual"/>
             </w:rPr>
           </w:pPr>
-          <w:hyperlink w:anchor="_Toc241786194" w:history="1">
+          <w:hyperlink w:anchor="_Toc241790303" w:history="1">
             <w:r>
               <w:rPr>
                 <w:rStyle w:val="Hyperlink"/>
@@ -1776,7 +1767,7 @@
                 <w:noProof/>
                 <w:webHidden/>
               </w:rPr>
-              <w:instrText xml:space="preserve"> PAGEREF _Toc241786194 \h </w:instrText>
+              <w:instrText xml:space="preserve"> PAGEREF _Toc241790303 \h </w:instrText>
             </w:r>
             <w:r>
               <w:rPr>
@@ -1796,7 +1787,7 @@
                 <w:noProof/>
                 <w:webHidden/>
               </w:rPr>
-              <w:t>7</w:t>
+              <w:t>6</w:t>
             </w:r>
             <w:r>
               <w:rPr>
@@ -1821,7 +1812,7 @@
               <w14:ligatures w14:val="standardContextual"/>
             </w:rPr>
           </w:pPr>
-          <w:hyperlink w:anchor="_Toc241786195" w:history="1">
+          <w:hyperlink w:anchor="_Toc241790304" w:history="1">
             <w:r>
               <w:rPr>
                 <w:rStyle w:val="Hyperlink"/>
@@ -1848,7 +1839,7 @@
                 <w:noProof/>
                 <w:webHidden/>
               </w:rPr>
-              <w:instrText xml:space="preserve"> PAGEREF _Toc241786195 \h </w:instrText>
+              <w:instrText xml:space="preserve"> PAGEREF _Toc241790304 \h </w:instrText>
             </w:r>
             <w:r>
               <w:rPr>
@@ -1868,7 +1859,7 @@
                 <w:noProof/>
                 <w:webHidden/>
               </w:rPr>
-              <w:t>7</w:t>
+              <w:t>6</w:t>
             </w:r>
             <w:r>
               <w:rPr>
@@ -1893,7 +1884,7 @@
               <w14:ligatures w14:val="standardContextual"/>
             </w:rPr>
           </w:pPr>
-          <w:hyperlink w:anchor="_Toc241786196" w:history="1">
+          <w:hyperlink w:anchor="_Toc241790305" w:history="1">
             <w:r>
               <w:rPr>
                 <w:rStyle w:val="Hyperlink"/>
@@ -1920,7 +1911,7 @@
                 <w:noProof/>
                 <w:webHidden/>
               </w:rPr>
-              <w:instrText xml:space="preserve"> PAGEREF _Toc241786196 \h </w:instrText>
+              <w:instrText xml:space="preserve"> PAGEREF _Toc241790305 \h </w:instrText>
             </w:r>
             <w:r>
               <w:rPr>
@@ -1940,7 +1931,7 @@
                 <w:noProof/>
                 <w:webHidden/>
               </w:rPr>
-              <w:t>7</w:t>
+              <w:t>6</w:t>
             </w:r>
             <w:r>
               <w:rPr>
@@ -1965,7 +1956,7 @@
               <w14:ligatures w14:val="standardContextual"/>
             </w:rPr>
           </w:pPr>
-          <w:hyperlink w:anchor="_Toc241786197" w:history="1">
+          <w:hyperlink w:anchor="_Toc241790306" w:history="1">
             <w:r>
               <w:rPr>
                 <w:rStyle w:val="Hyperlink"/>
@@ -1992,7 +1983,7 @@
                 <w:noProof/>
                 <w:webHidden/>
               </w:rPr>
-              <w:instrText xml:space="preserve"> PAGEREF _Toc241786197 \h </w:instrText>
+              <w:instrText xml:space="preserve"> PAGEREF _Toc241790306 \h </w:instrText>
             </w:r>
             <w:r>
               <w:rPr>
@@ -2012,7 +2003,7 @@
                 <w:noProof/>
                 <w:webHidden/>
               </w:rPr>
-              <w:t>7</w:t>
+              <w:t>6</w:t>
             </w:r>
             <w:r>
               <w:rPr>
@@ -2037,7 +2028,7 @@
               <w14:ligatures w14:val="standardContextual"/>
             </w:rPr>
           </w:pPr>
-          <w:hyperlink w:anchor="_Toc241786198" w:history="1">
+          <w:hyperlink w:anchor="_Toc241790307" w:history="1">
             <w:r>
               <w:rPr>
                 <w:rStyle w:val="Hyperlink"/>
@@ -2064,7 +2055,7 @@
                 <w:noProof/>
                 <w:webHidden/>
               </w:rPr>
-              <w:instrText xml:space="preserve"> PAGEREF _Toc241786198 \h </w:instrText>
+              <w:instrText xml:space="preserve"> PAGEREF _Toc241790307 \h </w:instrText>
             </w:r>
             <w:r>
               <w:rPr>
@@ -2084,7 +2075,7 @@
                 <w:noProof/>
                 <w:webHidden/>
               </w:rPr>
-              <w:t>8</w:t>
+              <w:t>7</w:t>
             </w:r>
             <w:r>
               <w:rPr>
@@ -2109,7 +2100,7 @@
               <w14:ligatures w14:val="standardContextual"/>
             </w:rPr>
           </w:pPr>
-          <w:hyperlink w:anchor="_Toc241786199" w:history="1">
+          <w:hyperlink w:anchor="_Toc241790308" w:history="1">
             <w:r>
               <w:rPr>
                 <w:rStyle w:val="Hyperlink"/>
@@ -2136,7 +2127,7 @@
                 <w:noProof/>
                 <w:webHidden/>
               </w:rPr>
-              <w:instrText xml:space="preserve"> PAGEREF _Toc241786199 \h </w:instrText>
+              <w:instrText xml:space="preserve"> PAGEREF _Toc241790308 \h </w:instrText>
             </w:r>
             <w:r>
               <w:rPr>
@@ -2156,7 +2147,7 @@
                 <w:noProof/>
                 <w:webHidden/>
               </w:rPr>
-              <w:t>9</w:t>
+              <w:t>8</w:t>
             </w:r>
             <w:r>
               <w:rPr>
@@ -2181,7 +2172,7 @@
               <w14:ligatures w14:val="standardContextual"/>
             </w:rPr>
           </w:pPr>
-          <w:hyperlink w:anchor="_Toc241786200" w:history="1">
+          <w:hyperlink w:anchor="_Toc241790309" w:history="1">
             <w:r>
               <w:rPr>
                 <w:rStyle w:val="Hyperlink"/>
@@ -2208,7 +2199,7 @@
                 <w:noProof/>
                 <w:webHidden/>
               </w:rPr>
-              <w:instrText xml:space="preserve"> PAGEREF _Toc241786200 \h </w:instrText>
+              <w:instrText xml:space="preserve"> PAGEREF _Toc241790309 \h </w:instrText>
             </w:r>
             <w:r>
               <w:rPr>
@@ -2228,7 +2219,7 @@
                 <w:noProof/>
                 <w:webHidden/>
               </w:rPr>
-              <w:t>9</w:t>
+              <w:t>8</w:t>
             </w:r>
             <w:r>
               <w:rPr>
@@ -2253,7 +2244,7 @@
               <w14:ligatures w14:val="standardContextual"/>
             </w:rPr>
           </w:pPr>
-          <w:hyperlink w:anchor="_Toc241786201" w:history="1">
+          <w:hyperlink w:anchor="_Toc241790310" w:history="1">
             <w:r>
               <w:rPr>
                 <w:rStyle w:val="Hyperlink"/>
@@ -2280,7 +2271,7 @@
                 <w:noProof/>
                 <w:webHidden/>
               </w:rPr>
-              <w:instrText xml:space="preserve"> PAGEREF _Toc241786201 \h </w:instrText>
+              <w:instrText xml:space="preserve"> PAGEREF _Toc241790310 \h </w:instrText>
             </w:r>
             <w:r>
               <w:rPr>
@@ -2300,7 +2291,7 @@
                 <w:noProof/>
                 <w:webHidden/>
               </w:rPr>
-              <w:t>10</w:t>
+              <w:t>9</w:t>
             </w:r>
             <w:r>
               <w:rPr>
@@ -2325,7 +2316,7 @@
               <w14:ligatures w14:val="standardContextual"/>
             </w:rPr>
           </w:pPr>
-          <w:hyperlink w:anchor="_Toc241786202" w:history="1">
+          <w:hyperlink w:anchor="_Toc241790311" w:history="1">
             <w:r>
               <w:rPr>
                 <w:rStyle w:val="Hyperlink"/>
@@ -2352,7 +2343,7 @@
                 <w:noProof/>
                 <w:webHidden/>
               </w:rPr>
-              <w:instrText xml:space="preserve"> PAGEREF _Toc241786202 \h </w:instrText>
+              <w:instrText xml:space="preserve"> PAGEREF _Toc241790311 \h </w:instrText>
             </w:r>
             <w:r>
               <w:rPr>
@@ -2372,7 +2363,7 @@
                 <w:noProof/>
                 <w:webHidden/>
               </w:rPr>
-              <w:t>10</w:t>
+              <w:t>9</w:t>
             </w:r>
             <w:r>
               <w:rPr>
@@ -2397,7 +2388,7 @@
               <w14:ligatures w14:val="standardContextual"/>
             </w:rPr>
           </w:pPr>
-          <w:hyperlink w:anchor="_Toc241786203" w:history="1">
+          <w:hyperlink w:anchor="_Toc241790312" w:history="1">
             <w:r>
               <w:rPr>
                 <w:rStyle w:val="Hyperlink"/>
@@ -2424,7 +2415,7 @@
                 <w:noProof/>
                 <w:webHidden/>
               </w:rPr>
-              <w:instrText xml:space="preserve"> PAGEREF _Toc241786203 \h </w:instrText>
+              <w:instrText xml:space="preserve"> PAGEREF _Toc241790312 \h </w:instrText>
             </w:r>
             <w:r>
               <w:rPr>
@@ -2444,7 +2435,7 @@
                 <w:noProof/>
                 <w:webHidden/>
               </w:rPr>
-              <w:t>10</w:t>
+              <w:t>9</w:t>
             </w:r>
             <w:r>
               <w:rPr>
@@ -2469,7 +2460,7 @@
               <w14:ligatures w14:val="standardContextual"/>
             </w:rPr>
           </w:pPr>
-          <w:hyperlink w:anchor="_Toc241786204" w:history="1">
+          <w:hyperlink w:anchor="_Toc241790313" w:history="1">
             <w:r>
               <w:rPr>
                 <w:rStyle w:val="Hyperlink"/>
@@ -2496,7 +2487,7 @@
                 <w:noProof/>
                 <w:webHidden/>
               </w:rPr>
-              <w:instrText xml:space="preserve"> PAGEREF _Toc241786204 \h </w:instrText>
+              <w:instrText xml:space="preserve"> PAGEREF _Toc241790313 \h </w:instrText>
             </w:r>
             <w:r>
               <w:rPr>
@@ -2516,7 +2507,7 @@
                 <w:noProof/>
                 <w:webHidden/>
               </w:rPr>
-              <w:t>10</w:t>
+              <w:t>9</w:t>
             </w:r>
             <w:r>
               <w:rPr>
@@ -2541,13 +2532,13 @@
               <w14:ligatures w14:val="standardContextual"/>
             </w:rPr>
           </w:pPr>
-          <w:hyperlink w:anchor="_Toc241786205" w:history="1">
+          <w:hyperlink w:anchor="_Toc241790314" w:history="1">
             <w:r>
               <w:rPr>
                 <w:rStyle w:val="Hyperlink"/>
                 <w:noProof/>
               </w:rPr>
-              <w:t>What’s different from the 2012 Windows version</w:t>
+              <w:t>What’s different from the 2012 Windows version?</w:t>
             </w:r>
             <w:r>
               <w:rPr>
@@ -2568,7 +2559,7 @@
                 <w:noProof/>
                 <w:webHidden/>
               </w:rPr>
-              <w:instrText xml:space="preserve"> PAGEREF _Toc241786205 \h </w:instrText>
+              <w:instrText xml:space="preserve"> PAGEREF _Toc241790314 \h </w:instrText>
             </w:r>
             <w:r>
               <w:rPr>
@@ -2588,7 +2579,7 @@
                 <w:noProof/>
                 <w:webHidden/>
               </w:rPr>
-              <w:t>11</w:t>
+              <w:t>10</w:t>
             </w:r>
             <w:r>
               <w:rPr>
@@ -2613,7 +2604,7 @@
               <w14:ligatures w14:val="standardContextual"/>
             </w:rPr>
           </w:pPr>
-          <w:hyperlink w:anchor="_Toc241786206" w:history="1">
+          <w:hyperlink w:anchor="_Toc241790315" w:history="1">
             <w:r>
               <w:rPr>
                 <w:rStyle w:val="Hyperlink"/>
@@ -2640,7 +2631,7 @@
                 <w:noProof/>
                 <w:webHidden/>
               </w:rPr>
-              <w:instrText xml:space="preserve"> PAGEREF _Toc241786206 \h </w:instrText>
+              <w:instrText xml:space="preserve"> PAGEREF _Toc241790315 \h </w:instrText>
             </w:r>
             <w:r>
               <w:rPr>
@@ -2660,7 +2651,7 @@
                 <w:noProof/>
                 <w:webHidden/>
               </w:rPr>
-              <w:t>11</w:t>
+              <w:t>10</w:t>
             </w:r>
             <w:r>
               <w:rPr>
@@ -2685,12 +2676,84 @@
               <w14:ligatures w14:val="standardContextual"/>
             </w:rPr>
           </w:pPr>
-          <w:hyperlink w:anchor="_Toc241786207" w:history="1">
+          <w:hyperlink w:anchor="_Toc241790316" w:history="1">
             <w:r>
               <w:rPr>
                 <w:rStyle w:val="Hyperlink"/>
                 <w:noProof/>
               </w:rPr>
+              <w:t>Citation for this work</w:t>
+            </w:r>
+            <w:r>
+              <w:rPr>
+                <w:noProof/>
+                <w:webHidden/>
+              </w:rPr>
+              <w:tab/>
+            </w:r>
+            <w:r>
+              <w:rPr>
+                <w:noProof/>
+                <w:webHidden/>
+              </w:rPr>
+              <w:fldChar w:fldCharType="begin"/>
+            </w:r>
+            <w:r>
+              <w:rPr>
+                <w:noProof/>
+                <w:webHidden/>
+              </w:rPr>
+              <w:instrText xml:space="preserve"> PAGEREF _Toc241790316 \h </w:instrText>
+            </w:r>
+            <w:r>
+              <w:rPr>
+                <w:noProof/>
+                <w:webHidden/>
+              </w:rPr>
+            </w:r>
+            <w:r>
+              <w:rPr>
+                <w:noProof/>
+                <w:webHidden/>
+              </w:rPr>
+              <w:fldChar w:fldCharType="separate"/>
+            </w:r>
+            <w:r>
+              <w:rPr>
+                <w:noProof/>
+                <w:webHidden/>
+              </w:rPr>
+              <w:t>10</w:t>
+            </w:r>
+            <w:r>
+              <w:rPr>
+                <w:noProof/>
+                <w:webHidden/>
+              </w:rPr>
+              <w:fldChar w:fldCharType="end"/>
+            </w:r>
+          </w:hyperlink>
+        </w:p>
+        <w:p>
+          <w:pPr>
+            <w:pStyle w:val="TOC1"/>
+            <w:tabs>
+              <w:tab w:val="right" w:leader="dot" w:pos="9344"/>
+            </w:tabs>
+            <w:rPr>
+              <w:rFonts w:asciiTheme="minorHAnsi" w:eastAsiaTheme="minorEastAsia" w:hAnsiTheme="minorHAnsi" w:cstheme="minorBidi"/>
+              <w:noProof/>
+              <w:kern w:val="2"/>
+              <w:sz w:val="24"/>
+              <w14:ligatures w14:val="standardContextual"/>
+            </w:rPr>
+          </w:pPr>
+          <w:hyperlink w:anchor="_Toc241790317" w:history="1">
+            <w:r>
+              <w:rPr>
+                <w:rStyle w:val="Hyperlink"/>
+                <w:noProof/>
+              </w:rPr>
               <w:t>Acknowledgements</w:t>
             </w:r>
             <w:r>
@@ -2712,7 +2775,7 @@
                 <w:noProof/>
                 <w:webHidden/>
               </w:rPr>
-              <w:instrText xml:space="preserve"> PAGEREF _Toc241786207 \h </w:instrText>
+              <w:instrText xml:space="preserve"> PAGEREF _Toc241790317 \h </w:instrText>
             </w:r>
             <w:r>
               <w:rPr>
@@ -2732,7 +2795,7 @@
                 <w:noProof/>
                 <w:webHidden/>
               </w:rPr>
-              <w:t>11</w:t>
+              <w:t>10</w:t>
             </w:r>
             <w:r>
               <w:rPr>
@@ -2775,7 +2838,7 @@
       <w:pPr>
         <w:pStyle w:val="Heading1"/>
       </w:pPr>
-      <w:bookmarkStart w:id="0" w:name="_Toc241786180"/>
+      <w:bookmarkStart w:id="0" w:name="_Toc241790289"/>
       <w:r>
         <w:lastRenderedPageBreak/>
         <w:t>Getting started and preparing the audio files</w:t>
@@ -2784,14 +2847,30 @@
     </w:p>
     <w:p>
       <w:r>
-        <w:t>The Newcastle audio ranking test (NeAR) is a mini-application for sorting and rating audio clips by repeated comparison. It is very simple to use. This edition of the manual describes the web version, which runs in your web browser. It replaces the 2012 Windows program and reads and writes the same results files.</w:t>
+        <w:t>The Newcastle audio ranking test (</w:t>
+      </w:r>
+      <w:proofErr w:type="spellStart"/>
+      <w:r>
+        <w:t>NeAR</w:t>
+      </w:r>
+      <w:proofErr w:type="spellEnd"/>
+      <w:r>
+        <w:t xml:space="preserve">) is a </w:t>
+      </w:r>
+      <w:proofErr w:type="gramStart"/>
+      <w:r>
+        <w:t>mini-application</w:t>
+      </w:r>
+      <w:proofErr w:type="gramEnd"/>
+      <w:r>
+        <w:t xml:space="preserve"> for sorting and rating audio clips by repeated comparison. It is very simple to use. This edition of the manual describes the web version, which runs in your web browser. It replaces the 2012 Windows program and reads and writes the same results files.</w:t>
       </w:r>
     </w:p>
     <w:p>
       <w:pPr>
         <w:pStyle w:val="Heading2"/>
       </w:pPr>
-      <w:bookmarkStart w:id="1" w:name="_Toc241786181"/>
+      <w:bookmarkStart w:id="1" w:name="_Toc241790290"/>
       <w:r>
         <w:t>Opening the app</w:t>
       </w:r>
@@ -2840,7 +2919,15 @@
         <w:t>NeAR.csv</w:t>
       </w:r>
       <w:r>
-        <w:t xml:space="preserve"> straight into it, just like the old Windows program. Other browsers (Safari, Firefox, and the browsers on iPads and phones) work too, but they can’t save into folders. Instead the results are kept inside the browser, and you download </w:t>
+        <w:t xml:space="preserve"> straight into it, just like the old Windows program. Other browsers (Safari, Firefox, and the browsers on iPads and phones) work too, but they can’t save into folders. </w:t>
+      </w:r>
+      <w:proofErr w:type="gramStart"/>
+      <w:r>
+        <w:t>Instead</w:t>
+      </w:r>
+      <w:proofErr w:type="gramEnd"/>
+      <w:r>
+        <w:t xml:space="preserve"> the results are kept inside the browser, and you download </w:t>
       </w:r>
       <w:r>
         <w:rPr>
@@ -2863,7 +2950,15 @@
     </w:p>
     <w:p>
       <w:r>
-        <w:t xml:space="preserve">If you’d like NeAR to behave like an ordinary program, with its own icon and window, you can install it. In Chrome or Edge (and on Android), click the </w:t>
+        <w:t xml:space="preserve">If you’d like </w:t>
+      </w:r>
+      <w:proofErr w:type="spellStart"/>
+      <w:r>
+        <w:t>NeAR</w:t>
+      </w:r>
+      <w:proofErr w:type="spellEnd"/>
+      <w:r>
+        <w:t xml:space="preserve"> to behave like an ordinary program, with its own icon and window, you can install it. In Chrome or Edge (and on Android), click the </w:t>
       </w:r>
       <w:r>
         <w:rPr>
@@ -2872,7 +2967,25 @@
         <w:t>Install app</w:t>
       </w:r>
       <w:r>
-        <w:t xml:space="preserve"> button at the top of the NeAR window; once installed, NeAR appears with your other programs and the button disappears. On an iPad or iPhone, use </w:t>
+        <w:t xml:space="preserve"> button at the top of the </w:t>
+      </w:r>
+      <w:proofErr w:type="spellStart"/>
+      <w:r>
+        <w:t>NeAR</w:t>
+      </w:r>
+      <w:proofErr w:type="spellEnd"/>
+      <w:r>
+        <w:t xml:space="preserve"> window; once installed, </w:t>
+      </w:r>
+      <w:proofErr w:type="spellStart"/>
+      <w:proofErr w:type="gramStart"/>
+      <w:r>
+        <w:t>NeAR</w:t>
+      </w:r>
+      <w:proofErr w:type="spellEnd"/>
+      <w:proofErr w:type="gramEnd"/>
+      <w:r>
+        <w:t xml:space="preserve"> appears with your other programs and the button disappears. On an iPad or iPhone, use </w:t>
       </w:r>
       <w:r>
         <w:rPr>
@@ -2906,15 +3019,20 @@
       <w:pPr>
         <w:pStyle w:val="Heading2"/>
       </w:pPr>
-      <w:bookmarkStart w:id="2" w:name="_Toc241786182"/>
+      <w:bookmarkStart w:id="2" w:name="_Toc241790291"/>
       <w:r>
         <w:t>Try it out with the example files</w:t>
       </w:r>
       <w:bookmarkEnd w:id="2"/>
     </w:p>
     <w:p>
-      <w:r>
-        <w:t>NeAR comes with a set of example files, so you can try it before preparing your own. They are synthetic recordings of a sustained “ah”, made with increasing amounts of hoarseness, so there is a right answer: 8 samples to rate (</w:t>
+      <w:proofErr w:type="spellStart"/>
+      <w:r>
+        <w:t>NeAR</w:t>
+      </w:r>
+      <w:proofErr w:type="spellEnd"/>
+      <w:r>
+        <w:t xml:space="preserve"> comes with a set of example files, so you can try it before preparing your own. They are synthetic recordings of a sustained “ah”, made with increasing amounts of hoarseness, so there is a right answer: 8 samples to rate (</w:t>
       </w:r>
       <w:r>
         <w:rPr>
@@ -2964,7 +3082,15 @@
         <w:t>Try with example files</w:t>
       </w:r>
       <w:r>
-        <w:t xml:space="preserve"> at the top of the start screen. The samples and references are loaded, the reference box is ticked and the session is named </w:t>
+        <w:t xml:space="preserve"> at the top of the start screen. The samples and references are loaded, the reference box is </w:t>
+      </w:r>
+      <w:proofErr w:type="gramStart"/>
+      <w:r>
+        <w:t>ticked</w:t>
+      </w:r>
+      <w:proofErr w:type="gramEnd"/>
+      <w:r>
+        <w:t xml:space="preserve"> and the session is named </w:t>
       </w:r>
       <w:r>
         <w:rPr>
@@ -2998,21 +3124,25 @@
       <w:r>
         <w:t xml:space="preserve"> link next to the button. Unzip the file, then choose its </w:t>
       </w:r>
+      <w:proofErr w:type="spellStart"/>
       <w:r>
         <w:rPr>
           <w:i/>
         </w:rPr>
         <w:t>TestItems</w:t>
       </w:r>
+      <w:proofErr w:type="spellEnd"/>
       <w:r>
         <w:t xml:space="preserve"> and </w:t>
       </w:r>
+      <w:proofErr w:type="spellStart"/>
       <w:r>
         <w:rPr>
           <w:i/>
         </w:rPr>
         <w:t>RefItems</w:t>
       </w:r>
+      <w:proofErr w:type="spellEnd"/>
       <w:r>
         <w:t xml:space="preserve"> folders. The file </w:t>
       </w:r>
@@ -3030,15 +3160,20 @@
       <w:pPr>
         <w:pStyle w:val="Heading2"/>
       </w:pPr>
-      <w:bookmarkStart w:id="3" w:name="_Toc241786183"/>
+      <w:bookmarkStart w:id="3" w:name="_Toc241790292"/>
       <w:r>
         <w:t>Getting the file format right</w:t>
       </w:r>
       <w:bookmarkEnd w:id="3"/>
     </w:p>
     <w:p>
-      <w:r>
-        <w:t xml:space="preserve">NeAR needs to have your audio files in .WAV format. This is pretty much the standard for uncompressed audio; if your software doesn’t create WAV files already, then it will almost certainly have an option to do so. If not, then there are many software applications that will convert between a bewildering array of different formats. I’d recommend the free audio editor </w:t>
+      <w:proofErr w:type="spellStart"/>
+      <w:r>
+        <w:t>NeAR</w:t>
+      </w:r>
+      <w:proofErr w:type="spellEnd"/>
+      <w:r>
+        <w:t xml:space="preserve"> needs to have your audio files in .WAV format. This is pretty much the standard for uncompressed audio; if your software doesn’t create WAV files already, then it will almost certainly have an option to do so. If not, then there are many software applications that will convert between a bewildering array of different formats. I’d recommend the free audio editor </w:t>
       </w:r>
       <w:r>
         <w:rPr>
@@ -3069,14 +3204,30 @@
         <w:t>NOTE:</w:t>
       </w:r>
       <w:r>
-        <w:t xml:space="preserve"> If you’ve got an over-riding reason to need to use wma or mp3 and you really can’t convert them to WAVs, then it would be fairly straightforward to adapt the software – I just didn’t do it yet.</w:t>
+        <w:t xml:space="preserve"> If you’ve got an over-riding reason to need to use </w:t>
+      </w:r>
+      <w:proofErr w:type="spellStart"/>
+      <w:r>
+        <w:t>wma</w:t>
+      </w:r>
+      <w:proofErr w:type="spellEnd"/>
+      <w:r>
+        <w:t xml:space="preserve"> or mp3 and you really can’t convert them to WAVs, then it would be </w:t>
+      </w:r>
+      <w:proofErr w:type="gramStart"/>
+      <w:r>
+        <w:t>fairly straightforward</w:t>
+      </w:r>
+      <w:proofErr w:type="gramEnd"/>
+      <w:r>
+        <w:t xml:space="preserve"> to adapt the software – I just didn’t do it yet.</w:t>
       </w:r>
     </w:p>
     <w:p>
       <w:pPr>
         <w:pStyle w:val="Heading2"/>
       </w:pPr>
-      <w:bookmarkStart w:id="4" w:name="_Toc241786184"/>
+      <w:bookmarkStart w:id="4" w:name="_Toc241790293"/>
       <w:r>
         <w:t>Put together the rating folder</w:t>
       </w:r>
@@ -3100,7 +3251,7 @@
       <w:pPr>
         <w:pStyle w:val="Heading2"/>
       </w:pPr>
-      <w:bookmarkStart w:id="5" w:name="_Toc241786185"/>
+      <w:bookmarkStart w:id="5" w:name="_Toc241790294"/>
       <w:r>
         <w:t>Optionally, put together a reference folder</w:t>
       </w:r>
@@ -3113,7 +3264,23 @@
     </w:p>
     <w:p>
       <w:r>
-        <w:t>When you come to do the rating, you won’t be able to move the reference files around. Therefore they need to be named correctly from the start. For example, if you’ve got 12 reference files you could name them: 01.wav … 12.wav, or A.wav … L.wav. The lowest number or letter will appear to the left on the screen, and should correspond to the ‘best’ sample – however you choose to interpret ‘best’.</w:t>
+        <w:t xml:space="preserve">When you come to do the rating, you won’t be able to move the reference files around. </w:t>
+      </w:r>
+      <w:proofErr w:type="gramStart"/>
+      <w:r>
+        <w:t>Therefore</w:t>
+      </w:r>
+      <w:proofErr w:type="gramEnd"/>
+      <w:r>
+        <w:t xml:space="preserve"> they need to be named correctly from the start. For example, if you’ve got 12 reference files you could name them: 01.wav … 12.wav, or A.wav … L.wav. The lowest number or letter will appear to the left on the </w:t>
+      </w:r>
+      <w:proofErr w:type="gramStart"/>
+      <w:r>
+        <w:t>screen, and</w:t>
+      </w:r>
+      <w:proofErr w:type="gramEnd"/>
+      <w:r>
+        <w:t xml:space="preserve"> should correspond to the ‘best’ sample – however you choose to interpret ‘best’.</w:t>
       </w:r>
     </w:p>
     <w:p/>
@@ -3124,7 +3291,7 @@
       <w:r>
         <w:br w:type="page"/>
       </w:r>
-      <w:bookmarkStart w:id="6" w:name="_Toc241786186"/>
+      <w:bookmarkStart w:id="6" w:name="_Toc241790295"/>
       <w:r>
         <w:lastRenderedPageBreak/>
         <w:t>Preparing the rating session</w:t>
@@ -3138,7 +3305,7 @@
       <w:pPr>
         <w:pStyle w:val="Heading2"/>
       </w:pPr>
-      <w:bookmarkStart w:id="7" w:name="_Toc241786187"/>
+      <w:bookmarkStart w:id="7" w:name="_Toc241790296"/>
       <w:r>
         <w:t>Select the files for rating</w:t>
       </w:r>
@@ -3146,7 +3313,20 @@
     </w:p>
     <w:p>
       <w:r>
-        <w:t xml:space="preserve">Open NeAR, and use the </w:t>
+        <w:t xml:space="preserve">Open </w:t>
+      </w:r>
+      <w:proofErr w:type="spellStart"/>
+      <w:proofErr w:type="gramStart"/>
+      <w:r>
+        <w:t>NeAR</w:t>
+      </w:r>
+      <w:proofErr w:type="spellEnd"/>
+      <w:r>
+        <w:t>, and</w:t>
+      </w:r>
+      <w:proofErr w:type="gramEnd"/>
+      <w:r>
+        <w:t xml:space="preserve"> use the </w:t>
       </w:r>
       <w:r>
         <w:rPr>
@@ -3155,12 +3335,40 @@
         <w:t>Choose folder…</w:t>
       </w:r>
       <w:r>
-        <w:t xml:space="preserve"> button at the top to pick out the folder you just created. Underneath, NeAR shows the name of the folder and the number of WAV files found there to rate.</w:t>
-      </w:r>
-    </w:p>
-    <w:p>
-      <w:r>
-        <w:t xml:space="preserve">In Chrome and Edge, the browser asks whether NeAR may view the files in the folder, and then whether it may save changes there. Allow both: NeAR needs to read the audio files and to write </w:t>
+        <w:t xml:space="preserve"> button at the top to pick out the folder you just created. Underneath, </w:t>
+      </w:r>
+      <w:proofErr w:type="spellStart"/>
+      <w:proofErr w:type="gramStart"/>
+      <w:r>
+        <w:t>NeAR</w:t>
+      </w:r>
+      <w:proofErr w:type="spellEnd"/>
+      <w:proofErr w:type="gramEnd"/>
+      <w:r>
+        <w:t xml:space="preserve"> shows the name of the folder and the number of WAV files found there to rate.</w:t>
+      </w:r>
+    </w:p>
+    <w:p>
+      <w:r>
+        <w:t xml:space="preserve">In Chrome and Edge, the browser asks whether </w:t>
+      </w:r>
+      <w:proofErr w:type="spellStart"/>
+      <w:proofErr w:type="gramStart"/>
+      <w:r>
+        <w:t>NeAR</w:t>
+      </w:r>
+      <w:proofErr w:type="spellEnd"/>
+      <w:proofErr w:type="gramEnd"/>
+      <w:r>
+        <w:t xml:space="preserve"> may view the files in the folder, and then whether it may save changes there. Allow both: </w:t>
+      </w:r>
+      <w:proofErr w:type="spellStart"/>
+      <w:r>
+        <w:t>NeAR</w:t>
+      </w:r>
+      <w:proofErr w:type="spellEnd"/>
+      <w:r>
+        <w:t xml:space="preserve"> needs to read the audio files and to write </w:t>
       </w:r>
       <w:r>
         <w:rPr>
@@ -3173,14 +3381,33 @@
       </w:r>
     </w:p>
     <w:p>
-      <w:r>
-        <w:t xml:space="preserve">NeAR remembers the folders you used last time. When you come back, a button such as </w:t>
+      <w:proofErr w:type="spellStart"/>
+      <w:r>
+        <w:t>NeAR</w:t>
+      </w:r>
+      <w:proofErr w:type="spellEnd"/>
+      <w:r>
+        <w:t xml:space="preserve"> remembers the folders you used last time. When you come back, a button such as </w:t>
       </w:r>
       <w:r>
         <w:rPr>
           <w:i/>
         </w:rPr>
-        <w:t>Use “TestItems” again</w:t>
+        <w:t>Use “</w:t>
+      </w:r>
+      <w:proofErr w:type="spellStart"/>
+      <w:r>
+        <w:rPr>
+          <w:i/>
+        </w:rPr>
+        <w:t>TestItems</w:t>
+      </w:r>
+      <w:proofErr w:type="spellEnd"/>
+      <w:r>
+        <w:rPr>
+          <w:i/>
+        </w:rPr>
+        <w:t>” again</w:t>
       </w:r>
       <w:r>
         <w:t xml:space="preserve"> appears; click it and confirm, rather than finding the folder again.</w:t>
@@ -3190,78 +3417,86 @@
       <w:r>
         <w:t xml:space="preserve">In other browsers there are two buttons, </w:t>
       </w:r>
+      <w:proofErr w:type="gramStart"/>
       <w:r>
         <w:rPr>
           <w:i/>
         </w:rPr>
+        <w:t>Choose</w:t>
+      </w:r>
+      <w:proofErr w:type="gramEnd"/>
+      <w:r>
+        <w:rPr>
+          <w:i/>
+        </w:rPr>
+        <w:t xml:space="preserve"> folder…</w:t>
+      </w:r>
+      <w:r>
+        <w:t xml:space="preserve"> and </w:t>
+      </w:r>
+      <w:r>
+        <w:rPr>
+          <w:i/>
+        </w:rPr>
+        <w:t>Choose files…</w:t>
+      </w:r>
+      <w:r>
+        <w:t xml:space="preserve">. On an iPad or phone, use </w:t>
+      </w:r>
+      <w:r>
+        <w:rPr>
+          <w:i/>
+        </w:rPr>
+        <w:t>Choose files…</w:t>
+      </w:r>
+      <w:r>
+        <w:t xml:space="preserve"> and select all the WAV files at once.</w:t>
+      </w:r>
+    </w:p>
+    <w:p>
+      <w:pPr>
+        <w:pStyle w:val="Heading2"/>
+      </w:pPr>
+      <w:bookmarkStart w:id="8" w:name="_Toc241790297"/>
+      <w:r>
+        <w:t>If necessary, select your reference files</w:t>
+      </w:r>
+      <w:bookmarkEnd w:id="8"/>
+    </w:p>
+    <w:p>
+      <w:r>
+        <w:t xml:space="preserve">If you want to use some reference files, tick the box and pick the relevant folder with the </w:t>
+      </w:r>
+      <w:r>
+        <w:rPr>
+          <w:i/>
+        </w:rPr>
         <w:t>Choose folder…</w:t>
       </w:r>
       <w:r>
-        <w:t xml:space="preserve"> and </w:t>
-      </w:r>
-      <w:r>
-        <w:rPr>
-          <w:i/>
-        </w:rPr>
-        <w:t>Choose files…</w:t>
-      </w:r>
-      <w:r>
-        <w:t xml:space="preserve">. On an iPad or phone, use </w:t>
-      </w:r>
-      <w:r>
-        <w:rPr>
-          <w:i/>
-        </w:rPr>
-        <w:t>Choose files…</w:t>
-      </w:r>
-      <w:r>
-        <w:t xml:space="preserve"> and select all the WAV files at once.</w:t>
+        <w:t xml:space="preserve"> button in the next box down.</w:t>
       </w:r>
     </w:p>
     <w:p>
       <w:pPr>
         <w:pStyle w:val="Heading2"/>
       </w:pPr>
-      <w:bookmarkStart w:id="8" w:name="_Toc241786188"/>
-      <w:r>
-        <w:t>If necessary, select your reference files</w:t>
-      </w:r>
-      <w:bookmarkEnd w:id="8"/>
-    </w:p>
-    <w:p>
-      <w:r>
-        <w:t xml:space="preserve">If you want to use some reference files, tick the box and pick the relevant folder with the </w:t>
-      </w:r>
-      <w:r>
-        <w:rPr>
-          <w:i/>
-        </w:rPr>
-        <w:t>Choose folder…</w:t>
-      </w:r>
-      <w:r>
-        <w:t xml:space="preserve"> button in the next box down.</w:t>
+      <w:bookmarkStart w:id="9" w:name="_Toc241790298"/>
+      <w:r>
+        <w:t>Choose a name to identify the rating session</w:t>
+      </w:r>
+      <w:bookmarkEnd w:id="9"/>
+    </w:p>
+    <w:p>
+      <w:r>
+        <w:t>To make the analysis easier, all the results go into the same file. The name you type here will help you identify this rating session. You can use the same name twice, but you’ll get a warning. The name can’t contain a comma, because that would upset the columns of the results file. The date and time of the session will also be saved, which might let you figure out which rater was which if you’ve forgotten.</w:t>
       </w:r>
     </w:p>
     <w:p>
       <w:pPr>
         <w:pStyle w:val="Heading2"/>
       </w:pPr>
-      <w:bookmarkStart w:id="9" w:name="_Toc241786189"/>
-      <w:r>
-        <w:t>Choose a name to identify the rating session</w:t>
-      </w:r>
-      <w:bookmarkEnd w:id="9"/>
-    </w:p>
-    <w:p>
-      <w:r>
-        <w:t>To make the analysis easier, all the results go into the same file. The name you type here will help you identify this rating session. You can use the same name twice, but you’ll get a warning. The name can’t contain a comma, because that would upset the columns of the results file. The date and time of the session will also be saved, which might let you figure out which rater was which if you’ve forgotten.</w:t>
-      </w:r>
-    </w:p>
-    <w:p>
-      <w:pPr>
-        <w:pStyle w:val="Heading2"/>
-      </w:pPr>
-      <w:bookmarkStart w:id="10" w:name="_Toc241786190"/>
+      <w:bookmarkStart w:id="10" w:name="_Toc241790299"/>
       <w:r>
         <w:t>Tick the rating options you want to use</w:t>
       </w:r>
@@ -3269,7 +3504,15 @@
     </w:p>
     <w:p>
       <w:r>
-        <w:t>Most of these are self–explanatory. It’s probably easier to have a trial run and just watch what happens when you pick the various options, but here is a short explanation of each (on the next page is a picture that might help guide you). NeAR remembers your choices for next time.</w:t>
+        <w:t xml:space="preserve">Most of these are self–explanatory. It’s probably easier to have a trial run and just watch what happens when you pick the various options, but here is a short explanation of each (on the next page is a picture that might help guide you). </w:t>
+      </w:r>
+      <w:proofErr w:type="spellStart"/>
+      <w:r>
+        <w:t>NeAR</w:t>
+      </w:r>
+      <w:proofErr w:type="spellEnd"/>
+      <w:r>
+        <w:t xml:space="preserve"> remembers your choices for next time.</w:t>
       </w:r>
     </w:p>
     <w:p>
@@ -3345,7 +3588,15 @@
         <w:ind w:left="357"/>
       </w:pPr>
       <w:r>
-        <w:t>The fourth tick box indicates how many times each sample has been played. Initially, it was in mind to restrict the users to playing the samples only a fixed number of times but this hasn’t proven necessary. If it would be useful then it would be a reasonably easy change.</w:t>
+        <w:t xml:space="preserve">The fourth tick box indicates how many times each sample has been played. Initially, it was in mind to restrict the users to playing the samples only a fixed number of </w:t>
+      </w:r>
+      <w:proofErr w:type="gramStart"/>
+      <w:r>
+        <w:t>times</w:t>
+      </w:r>
+      <w:proofErr w:type="gramEnd"/>
+      <w:r>
+        <w:t xml:space="preserve"> but this hasn’t proven necessary. If it would be useful then it would be a reasonably easy change.</w:t>
       </w:r>
     </w:p>
     <w:p>
@@ -3394,7 +3645,7 @@
         <w:ind w:left="357"/>
       </w:pPr>
       <w:r>
-        <w:t xml:space="preserve">The sixth tick box, ticked to begin with, animates the samples as they are dragged and dropped, so it is easier to see where each one goes. Untick it if movement on screen is uncomfortable for the rater.</w:t>
+        <w:t>The sixth tick box, ticked to begin with, animates the samples as they are dragged and dropped, so it is easier to see where each one goes. Untick it if movement on screen is uncomfortable for the rater.</w:t>
       </w:r>
     </w:p>
     <w:p>
@@ -3415,7 +3666,7 @@
       <w:r>
         <w:br w:type="page"/>
       </w:r>
-      <w:bookmarkStart w:id="11" w:name="_Toc241786191"/>
+      <w:bookmarkStart w:id="11" w:name="_Toc241790300"/>
       <w:r>
         <w:lastRenderedPageBreak/>
         <w:t>Start</w:t>
@@ -3442,9 +3693,9 @@
           <w:noProof/>
         </w:rPr>
         <w:drawing>
-          <wp:inline distT="0" distB="0" distL="0" distR="0" wp14:anchorId="2CD82FCE" wp14:editId="7C9E0A79">
-            <wp:extent cx="3949430" cy="4788683"/>
-            <wp:effectExtent l="0" t="0" r="635" b="1905"/>
+          <wp:inline distT="0" distB="0" distL="0" distR="0" wp14:anchorId="2CD82FCE" wp14:editId="4254A797">
+            <wp:extent cx="3597898" cy="4362450"/>
+            <wp:effectExtent l="0" t="0" r="3175" b="0"/>
             <wp:docPr id="13" name="Picture 1"/>
             <wp:cNvGraphicFramePr>
               <a:graphicFrameLocks xmlns:a="http://schemas.openxmlformats.org/drawingml/2006/main" noChangeAspect="1"/>
@@ -3474,7 +3725,7 @@
                   <pic:spPr bwMode="auto">
                     <a:xfrm>
                       <a:off x="0" y="0"/>
-                      <a:ext cx="3949430" cy="4788683"/>
+                      <a:ext cx="3603225" cy="4368909"/>
                     </a:xfrm>
                     <a:prstGeom prst="rect">
                       <a:avLst/>
@@ -3491,6 +3742,7 @@
         </w:drawing>
       </w:r>
     </w:p>
+    <w:p/>
     <w:p>
       <w:r>
         <w:t xml:space="preserve">Click the </w:t>
@@ -3542,10 +3794,17 @@
         </w:numPr>
       </w:pPr>
       <w:r>
-        <w:t>If you specified reference files they appear at the top of the screen in plain blue, as in the example below.</w:t>
-      </w:r>
-    </w:p>
-    <w:p/>
+        <w:t xml:space="preserve">If you specified reference </w:t>
+      </w:r>
+      <w:proofErr w:type="gramStart"/>
+      <w:r>
+        <w:t>files</w:t>
+      </w:r>
+      <w:proofErr w:type="gramEnd"/>
+      <w:r>
+        <w:t xml:space="preserve"> they appear at the top of the screen in plain blue, as in the example below.</w:t>
+      </w:r>
+    </w:p>
     <w:p>
       <w:pPr>
         <w:jc w:val="center"/>
@@ -3611,7 +3870,7 @@
       <w:pPr>
         <w:pStyle w:val="Heading1"/>
       </w:pPr>
-      <w:bookmarkStart w:id="12" w:name="_Toc241786192"/>
+      <w:bookmarkStart w:id="12" w:name="_Toc241790301"/>
       <w:r>
         <w:lastRenderedPageBreak/>
         <w:t>Perform</w:t>
@@ -3677,7 +3936,15 @@
         </w:numPr>
       </w:pPr>
       <w:r>
-        <w:t>Then, drag it up to the top box using the mouse (or your finger, on a touchscreen). It will turn bright-coloured when you drop it, to indicate that it has been rated.</w:t>
+        <w:t xml:space="preserve">Then, drag it up to the top box using the mouse (or your finger, on a touchscreen). It will turn </w:t>
+      </w:r>
+      <w:proofErr w:type="gramStart"/>
+      <w:r>
+        <w:t>bright-coloured</w:t>
+      </w:r>
+      <w:proofErr w:type="gramEnd"/>
+      <w:r>
+        <w:t xml:space="preserve"> when you drop it, to indicate that it has been rated.</w:t>
       </w:r>
     </w:p>
     <w:p>
@@ -3827,7 +4094,7 @@
       <w:pPr>
         <w:pStyle w:val="Heading1"/>
       </w:pPr>
-      <w:bookmarkStart w:id="13" w:name="_Toc241786193"/>
+      <w:bookmarkStart w:id="13" w:name="_Toc241790302"/>
       <w:r>
         <w:lastRenderedPageBreak/>
         <w:t>And then…</w:t>
@@ -3838,7 +4105,7 @@
       <w:pPr>
         <w:pStyle w:val="Heading2"/>
       </w:pPr>
-      <w:bookmarkStart w:id="14" w:name="_Toc241786194"/>
+      <w:bookmarkStart w:id="14" w:name="_Toc241790303"/>
       <w:r>
         <w:t>End the rating session</w:t>
       </w:r>
@@ -3882,7 +4149,7 @@
       <w:pPr>
         <w:pStyle w:val="Heading2"/>
       </w:pPr>
-      <w:bookmarkStart w:id="15" w:name="_Toc241786195"/>
+      <w:bookmarkStart w:id="15" w:name="_Toc241790304"/>
       <w:r>
         <w:t>Look at the results</w:t>
       </w:r>
@@ -3904,7 +4171,15 @@
     </w:p>
     <w:p>
       <w:r>
-        <w:t xml:space="preserve">In other browsers, the results are kept inside the browser, separately for each samples folder, and after each session NeAR offers to download an up-to-date copy of </w:t>
+        <w:t xml:space="preserve">In other browsers, the results are kept inside the browser, separately for each samples folder, and after each session </w:t>
+      </w:r>
+      <w:proofErr w:type="spellStart"/>
+      <w:r>
+        <w:t>NeAR</w:t>
+      </w:r>
+      <w:proofErr w:type="spellEnd"/>
+      <w:r>
+        <w:t xml:space="preserve"> offers to download an up-to-date copy of </w:t>
       </w:r>
       <w:r>
         <w:rPr>
@@ -3939,7 +4214,7 @@
       <w:pPr>
         <w:pStyle w:val="Heading1"/>
       </w:pPr>
-      <w:bookmarkStart w:id="16" w:name="_Toc241786196"/>
+      <w:bookmarkStart w:id="16" w:name="_Toc241790305"/>
       <w:r>
         <w:t>Finer</w:t>
       </w:r>
@@ -3957,7 +4232,7 @@
       <w:pPr>
         <w:pStyle w:val="Heading2"/>
       </w:pPr>
-      <w:bookmarkStart w:id="17" w:name="_Toc241786197"/>
+      <w:bookmarkStart w:id="17" w:name="_Toc241790306"/>
       <w:r>
         <w:t>How does the program deal with the results file NeAR</w:t>
       </w:r>
@@ -4080,7 +4355,15 @@
         </w:numPr>
       </w:pPr>
       <w:r>
-        <w:t xml:space="preserve">Normally, that’s the end of the story but occasionally the program fails to write the new results. This is probably because you’ve got the file open in another program. For example, Excel will lock the file and stop any other program from accessing it. In this case, you can close the other program and try again, or save the results as a new file. Be aware this is a one-off; the next set of results will go back to </w:t>
+        <w:t xml:space="preserve">Normally, that’s the end of the story but occasionally the program fails to write the new results. This is probably because you’ve got the file open in another program. For example, Excel will lock the file and stop any other program from accessing it. In this case, you can close the other program and try </w:t>
+      </w:r>
+      <w:proofErr w:type="gramStart"/>
+      <w:r>
+        <w:t>again, or</w:t>
+      </w:r>
+      <w:proofErr w:type="gramEnd"/>
+      <w:r>
+        <w:t xml:space="preserve"> save the results as a new file. Be aware this is a one-off; the next set of results will go back to </w:t>
       </w:r>
       <w:r>
         <w:rPr>
@@ -4102,7 +4385,7 @@
       <w:pPr>
         <w:pStyle w:val="Heading1"/>
       </w:pPr>
-      <w:bookmarkStart w:id="18" w:name="_Toc241786198"/>
+      <w:bookmarkStart w:id="18" w:name="_Toc241790307"/>
       <w:r>
         <w:lastRenderedPageBreak/>
         <w:t>Loading the data into Excel</w:t>
@@ -4345,7 +4628,7 @@
           </mc:Choice>
           <mc:Fallback>
             <w:pict>
-              <v:rect w14:anchorId="03EE8FD9" id="Rectangle 3" o:spid="_x0000_s1026" style="position:absolute;margin-left:34.5pt;margin-top:19.65pt;width:17pt;height:26pt;z-index:251659264;visibility:visible;mso-wrap-style:square;mso-width-percent:0;mso-wrap-distance-left:9pt;mso-wrap-distance-top:0;mso-wrap-distance-right:9pt;mso-wrap-distance-bottom:0;mso-position-horizontal:absolute;mso-position-horizontal-relative:text;mso-position-vertical:absolute;mso-position-vertical-relative:text;mso-width-percent:0;mso-width-relative:margin;v-text-anchor:middle" o:gfxdata="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" filled="f" strokecolor="#c00000" strokeweight="2pt"/>
+              <v:rect w14:anchorId="29D01E9B" id="Rectangle 3" o:spid="_x0000_s1026" style="position:absolute;margin-left:34.5pt;margin-top:19.65pt;width:17pt;height:26pt;z-index:251659264;visibility:visible;mso-wrap-style:square;mso-width-percent:0;mso-wrap-distance-left:9pt;mso-wrap-distance-top:0;mso-wrap-distance-right:9pt;mso-wrap-distance-bottom:0;mso-position-horizontal:absolute;mso-position-horizontal-relative:text;mso-position-vertical:absolute;mso-position-vertical-relative:text;mso-width-percent:0;mso-width-relative:margin;v-text-anchor:middle" o:gfxdata="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" filled="f" strokecolor="#c00000" strokeweight="2pt"/>
             </w:pict>
           </mc:Fallback>
         </mc:AlternateContent>
@@ -4548,7 +4831,7 @@
       <w:pPr>
         <w:pStyle w:val="Heading1"/>
       </w:pPr>
-      <w:bookmarkStart w:id="19" w:name="_Toc241786199"/>
+      <w:bookmarkStart w:id="19" w:name="_Toc241790308"/>
       <w:r>
         <w:lastRenderedPageBreak/>
         <w:t>The file format</w:t>
@@ -5013,6 +5296,7 @@
                 <w:szCs w:val="16"/>
               </w:rPr>
             </w:pPr>
+            <w:proofErr w:type="spellStart"/>
             <w:r>
               <w:rPr>
                 <w:rFonts w:ascii="Arial" w:hAnsi="Arial" w:cs="Arial"/>
@@ -5021,6 +5305,7 @@
               </w:rPr>
               <w:t>src</w:t>
             </w:r>
+            <w:proofErr w:type="spellEnd"/>
           </w:p>
         </w:tc>
         <w:tc>
@@ -5317,6 +5602,7 @@
                 <w:szCs w:val="16"/>
               </w:rPr>
             </w:pPr>
+            <w:proofErr w:type="spellStart"/>
             <w:r>
               <w:rPr>
                 <w:rFonts w:ascii="Arial" w:hAnsi="Arial" w:cs="Arial"/>
@@ -5325,6 +5611,7 @@
               </w:rPr>
               <w:t>src</w:t>
             </w:r>
+            <w:proofErr w:type="spellEnd"/>
           </w:p>
         </w:tc>
         <w:tc>
@@ -5621,6 +5908,7 @@
                 <w:szCs w:val="16"/>
               </w:rPr>
             </w:pPr>
+            <w:proofErr w:type="spellStart"/>
             <w:r>
               <w:rPr>
                 <w:rFonts w:ascii="Arial" w:hAnsi="Arial" w:cs="Arial"/>
@@ -5629,6 +5917,7 @@
               </w:rPr>
               <w:t>src</w:t>
             </w:r>
+            <w:proofErr w:type="spellEnd"/>
           </w:p>
         </w:tc>
         <w:tc>
@@ -5820,12 +6109,14 @@
       <w:r>
         <w:t xml:space="preserve">The folder </w:t>
       </w:r>
+      <w:proofErr w:type="spellStart"/>
       <w:r>
         <w:rPr>
           <w:i/>
         </w:rPr>
         <w:t>src</w:t>
       </w:r>
+      <w:proofErr w:type="spellEnd"/>
       <w:r>
         <w:t xml:space="preserve"> contained 4 WAV files, named </w:t>
       </w:r>
@@ -5936,6 +6227,7 @@
       <w:r>
         <w:t xml:space="preserve">Claire was unable to rate </w:t>
       </w:r>
+      <w:proofErr w:type="gramStart"/>
       <w:r>
         <w:rPr>
           <w:i/>
@@ -5943,7 +6235,11 @@
         <w:t>zz10</w:t>
       </w:r>
       <w:r>
-        <w:t>, but had the other three samples in the same order as before.</w:t>
+        <w:t>, but</w:t>
+      </w:r>
+      <w:proofErr w:type="gramEnd"/>
+      <w:r>
+        <w:t xml:space="preserve"> had the other three samples in the same order as before.</w:t>
       </w:r>
     </w:p>
     <w:p/>
@@ -5960,14 +6256,22 @@
     </w:p>
     <w:p>
       <w:r>
-        <w:t>SOURCE and REFERENCE give the name of the folder, because web browsers can’t see the full path. Rows written by the 2012 Windows version show the full path instead (C:\src), and dates in the style 25-Jul-08; old and new rows can sit in the same file without any problem.</w:t>
+        <w:t>SOURCE and REFERENCE give the name of the folder, because web browsers can’t see the full path. Rows written by the 2012 Windows version show the full path instead (C:\</w:t>
+      </w:r>
+      <w:proofErr w:type="spellStart"/>
+      <w:r>
+        <w:t>src</w:t>
+      </w:r>
+      <w:proofErr w:type="spellEnd"/>
+      <w:r>
+        <w:t>), and dates in the style 25-Jul-08; old and new rows can sit in the same file without any problem.</w:t>
       </w:r>
     </w:p>
     <w:p>
       <w:pPr>
         <w:pStyle w:val="Heading2"/>
       </w:pPr>
-      <w:bookmarkStart w:id="20" w:name="_Toc241786200"/>
+      <w:bookmarkStart w:id="20" w:name="_Toc241790309"/>
       <w:r>
         <w:t>Using reference files</w:t>
       </w:r>
@@ -6435,6 +6739,7 @@
                 <w:szCs w:val="16"/>
               </w:rPr>
             </w:pPr>
+            <w:proofErr w:type="spellStart"/>
             <w:r>
               <w:rPr>
                 <w:rFonts w:ascii="Arial" w:hAnsi="Arial" w:cs="Arial"/>
@@ -6443,6 +6748,7 @@
               </w:rPr>
               <w:t>src</w:t>
             </w:r>
+            <w:proofErr w:type="spellEnd"/>
           </w:p>
         </w:tc>
         <w:tc>
@@ -6755,6 +7061,7 @@
                 <w:szCs w:val="16"/>
               </w:rPr>
             </w:pPr>
+            <w:proofErr w:type="spellStart"/>
             <w:r>
               <w:rPr>
                 <w:rFonts w:ascii="Arial" w:hAnsi="Arial" w:cs="Arial"/>
@@ -6763,6 +7070,7 @@
               </w:rPr>
               <w:t>src</w:t>
             </w:r>
+            <w:proofErr w:type="spellEnd"/>
           </w:p>
         </w:tc>
         <w:tc>
@@ -7067,6 +7375,7 @@
                 <w:szCs w:val="16"/>
               </w:rPr>
             </w:pPr>
+            <w:proofErr w:type="spellStart"/>
             <w:r>
               <w:rPr>
                 <w:rFonts w:ascii="Arial" w:hAnsi="Arial" w:cs="Arial"/>
@@ -7075,6 +7384,7 @@
               </w:rPr>
               <w:t>src</w:t>
             </w:r>
+            <w:proofErr w:type="spellEnd"/>
           </w:p>
         </w:tc>
         <w:tc>
@@ -7266,7 +7576,23 @@
     <w:p/>
     <w:p>
       <w:r>
-        <w:t xml:space="preserve">The results for the reference samples aren’t included in the table because they always stay in the same order. Therefore there are still only 4 rankings. However, the rankings will now be in the range 1… 14. So for example, Ann thought that sample zz90 was better than </w:t>
+        <w:t xml:space="preserve">The results for the reference samples aren’t included in the table because they always stay in the same order. </w:t>
+      </w:r>
+      <w:proofErr w:type="gramStart"/>
+      <w:r>
+        <w:t>Therefore</w:t>
+      </w:r>
+      <w:proofErr w:type="gramEnd"/>
+      <w:r>
+        <w:t xml:space="preserve"> there are still only 4 rankings. However, the rankings will now be in the range 1… 14. </w:t>
+      </w:r>
+      <w:proofErr w:type="gramStart"/>
+      <w:r>
+        <w:t>So</w:t>
+      </w:r>
+      <w:proofErr w:type="gramEnd"/>
+      <w:r>
+        <w:t xml:space="preserve"> for example, Ann thought that sample zz90 was better than </w:t>
       </w:r>
       <w:r>
         <w:rPr>
@@ -7311,7 +7637,7 @@
       <w:pPr>
         <w:pStyle w:val="Heading1"/>
       </w:pPr>
-      <w:bookmarkStart w:id="21" w:name="_Toc241786201"/>
+      <w:bookmarkStart w:id="21" w:name="_Toc241790310"/>
       <w:r>
         <w:lastRenderedPageBreak/>
         <w:t>Analysing the data</w:t>
@@ -7322,7 +7648,7 @@
       <w:pPr>
         <w:pStyle w:val="Heading2"/>
       </w:pPr>
-      <w:bookmarkStart w:id="22" w:name="_Toc241786202"/>
+      <w:bookmarkStart w:id="22" w:name="_Toc241790311"/>
       <w:r>
         <w:t>Measures of agreement</w:t>
       </w:r>
@@ -7333,7 +7659,15 @@
         <w:t>The results of the ranking test have some special properties that make them amenable to some simple statistical measures of agreement.  Consider a group of 10 audio samples in a rating task. Each rank from 1 to 10</w:t>
       </w:r>
       <w:r>
-        <w:t xml:space="preserve"> will appear just once. Thus each set of ranki</w:t>
+        <w:t xml:space="preserve"> will appear just once. </w:t>
+      </w:r>
+      <w:proofErr w:type="gramStart"/>
+      <w:r>
+        <w:t>Thus</w:t>
+      </w:r>
+      <w:proofErr w:type="gramEnd"/>
+      <w:r>
+        <w:t xml:space="preserve"> each set of ranki</w:t>
       </w:r>
       <w:r>
         <w:t>ngs will have the same mean (5.5</w:t>
@@ -7342,8 +7676,13 @@
         <w:t xml:space="preserve">) and </w:t>
       </w:r>
       <w:r>
-        <w:t>the same standard deviation (3.0). Therefore</w:t>
-      </w:r>
+        <w:t xml:space="preserve">the same standard deviation (3.0). </w:t>
+      </w:r>
+      <w:proofErr w:type="gramStart"/>
+      <w:r>
+        <w:t>Therefore</w:t>
+      </w:r>
+      <w:proofErr w:type="gramEnd"/>
       <w:r>
         <w:t xml:space="preserve"> there </w:t>
       </w:r>
@@ -7351,7 +7690,15 @@
         <w:t>can</w:t>
       </w:r>
       <w:r>
-        <w:t xml:space="preserve"> no systematic bias between raters. </w:t>
+        <w:t xml:space="preserve"> no </w:t>
+      </w:r>
+      <w:proofErr w:type="gramStart"/>
+      <w:r>
+        <w:t>systematic</w:t>
+      </w:r>
+      <w:proofErr w:type="gramEnd"/>
+      <w:r>
+        <w:t xml:space="preserve"> bias between raters. </w:t>
       </w:r>
       <w:r>
         <w:t xml:space="preserve">Under these circumstances many </w:t>
@@ -7376,7 +7723,7 @@
       <w:pPr>
         <w:pStyle w:val="Heading2"/>
       </w:pPr>
-      <w:bookmarkStart w:id="23" w:name="_Toc241786203"/>
+      <w:bookmarkStart w:id="23" w:name="_Toc241790312"/>
       <w:r>
         <w:t>Unrated samples</w:t>
       </w:r>
@@ -7395,7 +7742,15 @@
         </w:numPr>
       </w:pPr>
       <w:r>
-        <w:t>First, the unrated samples will all be given the value zero. For most analysis, this is NOT the same as missing data. The zeros might be useful in some circumstances, for example to create a histogram showing missing data. HOWEVER in most cases you will need to replace the zeros with a blank, or whatever your own software uses to indicate missing data.</w:t>
+        <w:t xml:space="preserve">First, the unrated samples will all be given the value zero. For most analysis, this is NOT the same as missing data. The zeros might be useful in some circumstances, for example to create a histogram showing missing data. </w:t>
+      </w:r>
+      <w:proofErr w:type="gramStart"/>
+      <w:r>
+        <w:t>HOWEVER</w:t>
+      </w:r>
+      <w:proofErr w:type="gramEnd"/>
+      <w:r>
+        <w:t xml:space="preserve"> in most cases you will need to replace the zeros with a blank, or whatever your own software uses to indicate missing data.</w:t>
       </w:r>
     </w:p>
     <w:p>
@@ -7413,7 +7768,7 @@
       <w:pPr>
         <w:pStyle w:val="Heading2"/>
       </w:pPr>
-      <w:bookmarkStart w:id="24" w:name="_Toc241786204"/>
+      <w:bookmarkStart w:id="24" w:name="_Toc241790313"/>
       <w:r>
         <w:t>Using reference files</w:t>
       </w:r>
@@ -7421,7 +7776,15 @@
     </w:p>
     <w:p>
       <w:r>
-        <w:t>For similar reasons, if you’re using reference audio samples these special properties don’t hold true because the ranks of the reference files are not included in the results.  Therefore one rater might rank all the samples as better than the reference samples, while the next rater ranks them all as worse.</w:t>
+        <w:t xml:space="preserve">For similar reasons, if you’re using reference audio samples these special properties don’t hold true because the ranks of the reference files are not included in the results.  </w:t>
+      </w:r>
+      <w:proofErr w:type="gramStart"/>
+      <w:r>
+        <w:t>Therefore</w:t>
+      </w:r>
+      <w:proofErr w:type="gramEnd"/>
+      <w:r>
+        <w:t xml:space="preserve"> one rater might rank all the samples as better than the reference samples, while the next rater ranks them all as worse.</w:t>
       </w:r>
     </w:p>
     <w:p>
@@ -7445,15 +7808,15 @@
       <w:pPr>
         <w:pStyle w:val="Heading1"/>
       </w:pPr>
-      <w:bookmarkStart w:id="25" w:name="_Toc241786205"/>
+      <w:bookmarkStart w:id="25" w:name="_Toc241790314"/>
       <w:r>
         <w:lastRenderedPageBreak/>
         <w:t>What’s different from the 2012 Windows version</w:t>
       </w:r>
+      <w:r>
+        <w:t>?</w:t>
+      </w:r>
       <w:bookmarkEnd w:id="25"/>
-      <w:r>
-        <w:t>?</w:t>
-      </w:r>
     </w:p>
     <w:p>
       <w:r>
@@ -7562,7 +7925,7 @@
       <w:pPr>
         <w:pStyle w:val="Heading1"/>
       </w:pPr>
-      <w:bookmarkStart w:id="26" w:name="_Toc241786206"/>
+      <w:bookmarkStart w:id="26" w:name="_Toc241790315"/>
       <w:r>
         <w:t>References</w:t>
       </w:r>
@@ -7575,11 +7938,19 @@
       <w:r>
         <w:t xml:space="preserve">Clopper CG. Auditory free classification: Methods and analysis. </w:t>
       </w:r>
+      <w:proofErr w:type="spellStart"/>
       <w:r>
         <w:rPr>
           <w:i/>
         </w:rPr>
-        <w:t>Behavior Research Methods</w:t>
+        <w:t>Behavior</w:t>
+      </w:r>
+      <w:proofErr w:type="spellEnd"/>
+      <w:r>
+        <w:rPr>
+          <w:i/>
+        </w:rPr>
+        <w:t xml:space="preserve"> Research Methods</w:t>
       </w:r>
       <w:r>
         <w:t xml:space="preserve"> 2008; 40: 575-581.</w:t>
@@ -7592,11 +7963,19 @@
       <w:r>
         <w:t xml:space="preserve">Granqvist S. The visual sort and rate method of perceptual evaluation in listening tests. </w:t>
       </w:r>
+      <w:proofErr w:type="spellStart"/>
       <w:r>
         <w:rPr>
           <w:i/>
         </w:rPr>
-        <w:t>Logopedics Phoniatrics Vocology</w:t>
+        <w:t>Logopedics</w:t>
+      </w:r>
+      <w:proofErr w:type="spellEnd"/>
+      <w:r>
+        <w:rPr>
+          <w:i/>
+        </w:rPr>
+        <w:t xml:space="preserve"> Phoniatrics Vocology</w:t>
       </w:r>
       <w:r>
         <w:t xml:space="preserve"> 2003; 28: 109-116.</w:t>
@@ -7668,10 +8047,11 @@
       <w:pPr>
         <w:pStyle w:val="Heading1"/>
       </w:pPr>
-      <w:bookmarkStart w:id="27" w:name="_Toc241786207"/>
+      <w:bookmarkStart w:id="27" w:name="_Toc241790316"/>
       <w:r>
         <w:t>Citation for this work</w:t>
       </w:r>
+      <w:bookmarkEnd w:id="27"/>
     </w:p>
     <w:p>
       <w:pPr>
@@ -7709,10 +8089,11 @@
       <w:pPr>
         <w:pStyle w:val="Heading1"/>
       </w:pPr>
+      <w:bookmarkStart w:id="28" w:name="_Toc241790317"/>
       <w:r>
         <w:t>Acknowledgements</w:t>
       </w:r>
-      <w:bookmarkEnd w:id="27"/>
+      <w:bookmarkEnd w:id="28"/>
     </w:p>
     <w:p>
       <w:r>
@@ -7745,7 +8126,19 @@
     <w:p/>
     <w:p>
       <w:r>
-        <w:t>Thanks also to Claude for help with the translation from C# to TypeScript.</w:t>
+        <w:t xml:space="preserve">Thanks also to Claude for help with the translation from C# </w:t>
+      </w:r>
+      <w:r>
+        <w:t xml:space="preserve">(Windows desktop) </w:t>
+      </w:r>
+      <w:r>
+        <w:t>to TypeScript</w:t>
+      </w:r>
+      <w:r>
+        <w:t xml:space="preserve"> (web app)</w:t>
+      </w:r>
+      <w:r>
+        <w:t>.</w:t>
       </w:r>
     </w:p>
     <w:p/>
@@ -9080,6 +9473,7 @@
   <w:style w:type="character" w:default="1" w:styleId="DefaultParagraphFont">
     <w:name w:val="Default Paragraph Font"/>
     <w:uiPriority w:val="1"/>
+    <w:semiHidden/>
     <w:unhideWhenUsed/>
   </w:style>
   <w:style w:type="table" w:default="1" w:styleId="TableNormal">
@@ -9431,6 +9825,7 @@
     <w:sig w:usb0="E4002EFF" w:usb1="C200247B" w:usb2="00000009" w:usb3="00000000" w:csb0="000001FF" w:csb1="00000000"/>
   </w:font>
   <w:font w:name="MS Mincho">
+    <w:altName w:val="ＭＳ 明朝"/>
     <w:panose1 w:val="02020609040205080304"/>
     <w:charset w:val="80"/>
     <w:family w:val="modern"/>
@@ -9485,6 +9880,8 @@
     <w:rsid w:val="00332B1A"/>
     <w:rsid w:val="004522CD"/>
     <w:rsid w:val="005760F9"/>
+    <w:rsid w:val="005C13B6"/>
+    <w:rsid w:val="005D6A66"/>
     <w:rsid w:val="00751B80"/>
     <w:rsid w:val="00A45C21"/>
     <w:rsid w:val="00B30F14"/>

</xml_diff>

<commit_message>
Manual: remove the answer-key sentences from 'Try it out'
Co-Authored-By: Claude Opus 5.5 (1M context) <noreply@anthropic.com>
</commit_message>
<xml_diff>
--- a/docs/NeAR-user-manual.docx
+++ b/docs/NeAR-user-manual.docx
@@ -3032,7 +3032,7 @@
       </w:r>
       <w:proofErr w:type="spellEnd"/>
       <w:r>
-        <w:t xml:space="preserve"> comes with a set of example files, so you can try it before preparing your own. They are synthetic recordings of a sustained “ah”, made with increasing amounts of hoarseness, so there is a right answer: 8 samples to rate (</w:t>
+        <w:t xml:space="preserve"> comes with a set of example files, so you can try it before preparing your own. They are synthetic recordings of a sustained “ah”, made with varying amounts of hoarseness: 8 samples to rate (</w:t>
       </w:r>
       <w:r>
         <w:rPr>
@@ -3144,16 +3144,7 @@
       </w:r>
       <w:proofErr w:type="spellEnd"/>
       <w:r>
-        <w:t xml:space="preserve"> folders. The file </w:t>
-      </w:r>
-      <w:r>
-        <w:rPr>
-          <w:i/>
-        </w:rPr>
-        <w:t>ANSWER-KEY.txt</w:t>
-      </w:r>
-      <w:r>
-        <w:t xml:space="preserve"> in the zip gives the correct order, so you can check your ranking.</w:t>
+        <w:t xml:space="preserve"> folders.</w:t>
       </w:r>
     </w:p>
     <w:p>

</xml_diff>